<commit_message>
implement decision tree in C and update project documentation
</commit_message>
<xml_diff>
--- a/Mini_Project_Report.docx
+++ b/Mini_Project_Report.docx
@@ -27,7 +27,7 @@
         </w:rPr>
         <w:t>Data Structures and Algorithms – Individual Mini-Project Report</w:t>
         <w:br/>
-        <w:t>Deterministic Binary Decision Tree Architecture with 16 Specialized Trajectories</w:t>
+        <w:t>Pure C Implementation Using Pointers, Heap Allocation, LIFO Stack &amp; FIFO Queue</w:t>
       </w:r>
     </w:p>
     <w:tbl>
@@ -46,10 +46,10 @@
             <w:tcW w:type="dxa" w:w="3168"/>
             <w:shd w:val="clear" w:color="auto" w:fill="F1F5F9"/>
             <w:tcMar>
-              <w:top w:w="60" w:type="dxa"/>
-              <w:bottom w:w="60" w:type="dxa"/>
-              <w:left w:w="100" w:type="dxa"/>
-              <w:right w:w="100" w:type="dxa"/>
+              <w:top w:w="50" w:type="dxa"/>
+              <w:bottom w:w="50" w:type="dxa"/>
+              <w:left w:w="90" w:type="dxa"/>
+              <w:right w:w="90" w:type="dxa"/>
             </w:tcMar>
           </w:tcPr>
           <w:p>
@@ -67,10 +67,10 @@
             <w:tcW w:type="dxa" w:w="6192"/>
             <w:shd w:val="clear" w:color="auto" w:fill="FFFFFF"/>
             <w:tcMar>
-              <w:top w:w="60" w:type="dxa"/>
-              <w:bottom w:w="60" w:type="dxa"/>
-              <w:left w:w="100" w:type="dxa"/>
-              <w:right w:w="100" w:type="dxa"/>
+              <w:top w:w="50" w:type="dxa"/>
+              <w:bottom w:w="50" w:type="dxa"/>
+              <w:left w:w="90" w:type="dxa"/>
+              <w:right w:w="90" w:type="dxa"/>
             </w:tcMar>
           </w:tcPr>
           <w:p>
@@ -86,10 +86,10 @@
             <w:tcW w:type="dxa" w:w="3168"/>
             <w:shd w:val="clear" w:color="auto" w:fill="F1F5F9"/>
             <w:tcMar>
-              <w:top w:w="60" w:type="dxa"/>
-              <w:bottom w:w="60" w:type="dxa"/>
-              <w:left w:w="100" w:type="dxa"/>
-              <w:right w:w="100" w:type="dxa"/>
+              <w:top w:w="50" w:type="dxa"/>
+              <w:bottom w:w="50" w:type="dxa"/>
+              <w:left w:w="90" w:type="dxa"/>
+              <w:right w:w="90" w:type="dxa"/>
             </w:tcMar>
           </w:tcPr>
           <w:p>
@@ -107,10 +107,10 @@
             <w:tcW w:type="dxa" w:w="6192"/>
             <w:shd w:val="clear" w:color="auto" w:fill="FFFFFF"/>
             <w:tcMar>
-              <w:top w:w="60" w:type="dxa"/>
-              <w:bottom w:w="60" w:type="dxa"/>
-              <w:left w:w="100" w:type="dxa"/>
-              <w:right w:w="100" w:type="dxa"/>
+              <w:top w:w="50" w:type="dxa"/>
+              <w:bottom w:w="50" w:type="dxa"/>
+              <w:left w:w="90" w:type="dxa"/>
+              <w:right w:w="90" w:type="dxa"/>
             </w:tcMar>
           </w:tcPr>
           <w:p>
@@ -126,10 +126,10 @@
             <w:tcW w:type="dxa" w:w="3168"/>
             <w:shd w:val="clear" w:color="auto" w:fill="F1F5F9"/>
             <w:tcMar>
-              <w:top w:w="60" w:type="dxa"/>
-              <w:bottom w:w="60" w:type="dxa"/>
-              <w:left w:w="100" w:type="dxa"/>
-              <w:right w:w="100" w:type="dxa"/>
+              <w:top w:w="50" w:type="dxa"/>
+              <w:bottom w:w="50" w:type="dxa"/>
+              <w:left w:w="90" w:type="dxa"/>
+              <w:right w:w="90" w:type="dxa"/>
             </w:tcMar>
           </w:tcPr>
           <w:p>
@@ -147,10 +147,10 @@
             <w:tcW w:type="dxa" w:w="6192"/>
             <w:shd w:val="clear" w:color="auto" w:fill="FFFFFF"/>
             <w:tcMar>
-              <w:top w:w="60" w:type="dxa"/>
-              <w:bottom w:w="60" w:type="dxa"/>
-              <w:left w:w="100" w:type="dxa"/>
-              <w:right w:w="100" w:type="dxa"/>
+              <w:top w:w="50" w:type="dxa"/>
+              <w:bottom w:w="50" w:type="dxa"/>
+              <w:left w:w="90" w:type="dxa"/>
+              <w:right w:w="90" w:type="dxa"/>
             </w:tcMar>
           </w:tcPr>
           <w:p>
@@ -166,10 +166,10 @@
             <w:tcW w:type="dxa" w:w="3168"/>
             <w:shd w:val="clear" w:color="auto" w:fill="F1F5F9"/>
             <w:tcMar>
-              <w:top w:w="60" w:type="dxa"/>
-              <w:bottom w:w="60" w:type="dxa"/>
-              <w:left w:w="100" w:type="dxa"/>
-              <w:right w:w="100" w:type="dxa"/>
+              <w:top w:w="50" w:type="dxa"/>
+              <w:bottom w:w="50" w:type="dxa"/>
+              <w:left w:w="90" w:type="dxa"/>
+              <w:right w:w="90" w:type="dxa"/>
             </w:tcMar>
           </w:tcPr>
           <w:p>
@@ -187,10 +187,10 @@
             <w:tcW w:type="dxa" w:w="6192"/>
             <w:shd w:val="clear" w:color="auto" w:fill="FFFFFF"/>
             <w:tcMar>
-              <w:top w:w="60" w:type="dxa"/>
-              <w:bottom w:w="60" w:type="dxa"/>
-              <w:left w:w="100" w:type="dxa"/>
-              <w:right w:w="100" w:type="dxa"/>
+              <w:top w:w="50" w:type="dxa"/>
+              <w:bottom w:w="50" w:type="dxa"/>
+              <w:left w:w="90" w:type="dxa"/>
+              <w:right w:w="90" w:type="dxa"/>
             </w:tcMar>
           </w:tcPr>
           <w:p>
@@ -206,10 +206,10 @@
             <w:tcW w:type="dxa" w:w="3168"/>
             <w:shd w:val="clear" w:color="auto" w:fill="F1F5F9"/>
             <w:tcMar>
-              <w:top w:w="60" w:type="dxa"/>
-              <w:bottom w:w="60" w:type="dxa"/>
-              <w:left w:w="100" w:type="dxa"/>
-              <w:right w:w="100" w:type="dxa"/>
+              <w:top w:w="50" w:type="dxa"/>
+              <w:bottom w:w="50" w:type="dxa"/>
+              <w:left w:w="90" w:type="dxa"/>
+              <w:right w:w="90" w:type="dxa"/>
             </w:tcMar>
           </w:tcPr>
           <w:p>
@@ -227,10 +227,10 @@
             <w:tcW w:type="dxa" w:w="6192"/>
             <w:shd w:val="clear" w:color="auto" w:fill="FFFFFF"/>
             <w:tcMar>
-              <w:top w:w="60" w:type="dxa"/>
-              <w:bottom w:w="60" w:type="dxa"/>
-              <w:left w:w="100" w:type="dxa"/>
-              <w:right w:w="100" w:type="dxa"/>
+              <w:top w:w="50" w:type="dxa"/>
+              <w:bottom w:w="50" w:type="dxa"/>
+              <w:left w:w="90" w:type="dxa"/>
+              <w:right w:w="90" w:type="dxa"/>
             </w:tcMar>
           </w:tcPr>
           <w:p>
@@ -246,10 +246,10 @@
             <w:tcW w:type="dxa" w:w="3168"/>
             <w:shd w:val="clear" w:color="auto" w:fill="F1F5F9"/>
             <w:tcMar>
-              <w:top w:w="60" w:type="dxa"/>
-              <w:bottom w:w="60" w:type="dxa"/>
-              <w:left w:w="100" w:type="dxa"/>
-              <w:right w:w="100" w:type="dxa"/>
+              <w:top w:w="50" w:type="dxa"/>
+              <w:bottom w:w="50" w:type="dxa"/>
+              <w:left w:w="90" w:type="dxa"/>
+              <w:right w:w="90" w:type="dxa"/>
             </w:tcMar>
           </w:tcPr>
           <w:p>
@@ -258,7 +258,7 @@
                 <w:b/>
                 <w:color w:val="0F172A"/>
               </w:rPr>
-              <w:t>Project Title:</w:t>
+              <w:t>Implementation Language:</w:t>
             </w:r>
           </w:p>
         </w:tc>
@@ -267,15 +267,15 @@
             <w:tcW w:type="dxa" w:w="6192"/>
             <w:shd w:val="clear" w:color="auto" w:fill="FFFFFF"/>
             <w:tcMar>
-              <w:top w:w="60" w:type="dxa"/>
-              <w:bottom w:w="60" w:type="dxa"/>
-              <w:left w:w="100" w:type="dxa"/>
-              <w:right w:w="100" w:type="dxa"/>
+              <w:top w:w="50" w:type="dxa"/>
+              <w:bottom w:w="50" w:type="dxa"/>
+              <w:left w:w="90" w:type="dxa"/>
+              <w:right w:w="90" w:type="dxa"/>
             </w:tcMar>
           </w:tcPr>
           <w:p>
             <w:r>
-              <w:t>CareerTree — Deterministic Binary Decision Tree Career Advisor</w:t>
+              <w:t>C (C99 Standard, GCC 15.2.0 Compiler)</w:t>
             </w:r>
           </w:p>
         </w:tc>
@@ -286,10 +286,10 @@
             <w:tcW w:type="dxa" w:w="3168"/>
             <w:shd w:val="clear" w:color="auto" w:fill="F1F5F9"/>
             <w:tcMar>
-              <w:top w:w="60" w:type="dxa"/>
-              <w:bottom w:w="60" w:type="dxa"/>
-              <w:left w:w="100" w:type="dxa"/>
-              <w:right w:w="100" w:type="dxa"/>
+              <w:top w:w="50" w:type="dxa"/>
+              <w:bottom w:w="50" w:type="dxa"/>
+              <w:left w:w="90" w:type="dxa"/>
+              <w:right w:w="90" w:type="dxa"/>
             </w:tcMar>
           </w:tcPr>
           <w:p>
@@ -307,10 +307,10 @@
             <w:tcW w:type="dxa" w:w="6192"/>
             <w:shd w:val="clear" w:color="auto" w:fill="FFFFFF"/>
             <w:tcMar>
-              <w:top w:w="60" w:type="dxa"/>
-              <w:bottom w:w="60" w:type="dxa"/>
-              <w:left w:w="100" w:type="dxa"/>
-              <w:right w:w="100" w:type="dxa"/>
+              <w:top w:w="50" w:type="dxa"/>
+              <w:bottom w:w="50" w:type="dxa"/>
+              <w:left w:w="90" w:type="dxa"/>
+              <w:right w:w="90" w:type="dxa"/>
             </w:tcMar>
           </w:tcPr>
           <w:p>
@@ -335,19 +335,38 @@
         <w:rPr>
           <w:b/>
           <w:color w:val="0F172A"/>
-          <w:sz w:val="30"/>
+          <w:sz w:val="29"/>
         </w:rPr>
         <w:t>1. Problem Statement</w:t>
       </w:r>
     </w:p>
     <w:p>
       <w:r>
-        <w:t>Students and early-career technology aspirants frequently experience severe career decision paralysis due to the rapid diversification of modern computer science and engineering disciplines. For instance, distinguishing between overlapping domains—such as Deep Learning Research vs. Production MLOps, or Cloud Architecture vs. Offensive Cybersecurity, or UX Qualitative Research vs. Design Systems Architecture—demands clear, structured, and logical guidance.</w:t>
+        <w:t>Students and early-career technology aspirants frequently experience severe career decision paralysis due to the rapid diversification of modern computer science disciplines (e.g., distinguishing between AI Research, MLOps, Cloud Architecture, Quantitative Finance, and UX Research). Traditional commercial career tests often rely on opaque, black-box machine learning models that generate recommendations without transparent, explainable decision rationales, or flat non-hierarchical forms that lack dynamic state backtracking.</w:t>
       </w:r>
     </w:p>
     <w:p>
       <w:r>
-        <w:t>Existing commercial career guidance tools frequently suffer from major architectural drawbacks:</w:t>
+        <w:t>To solve this, there is a fundamental need for a deterministic, hierarchical, and mathematically grounded career guidance engine implemented in C using an explicit Binary Decision Tree data structure. Such an engine must narrow the search space in logarithmic time O(log2 N), maintain an auditable LIFO stack for backtracking, support Level-Order BFS traversal via a FIFO queue, and manage memory cleanly on the heap.</w:t>
+      </w:r>
+    </w:p>
+    <w:p>
+      <w:pPr>
+        <w:keepNext/>
+        <w:spacing w:before="280" w:after="80"/>
+      </w:pPr>
+      <w:r>
+        <w:rPr>
+          <w:b/>
+          <w:color w:val="0F172A"/>
+          <w:sz w:val="29"/>
+        </w:rPr>
+        <w:t>2. Motivation</w:t>
+      </w:r>
+    </w:p>
+    <w:p>
+      <w:r>
+        <w:t>Implementing an explicit Binary Decision Tree in pure C provides an ideal pedagogical demonstration of core Data Structures and Algorithms (DSA) concepts without reliance on high-level language abstractions:</w:t>
       </w:r>
     </w:p>
     <w:p>
@@ -360,10 +379,10 @@
           <w:b/>
           <w:color w:val="0F172A"/>
         </w:rPr>
-        <w:t>1. Lack of Explainability:</w:t>
+        <w:t>1. Pointer Mechanics &amp; Heap Allocation:</w:t>
       </w:r>
       <w:r>
-        <w:t xml:space="preserve"> Many modern systems use opaque, black-box statistical or machine learning models that generate recommendations without transparent, explainable decision rationales.</w:t>
+        <w:t xml:space="preserve"> Utilizing raw struct pointers (`struct DecisionNode* yes;` and `struct DecisionNode* no;`) to construct a non-linear hierarchical graph in heap memory.</w:t>
       </w:r>
     </w:p>
     <w:p>
@@ -376,10 +395,10 @@
           <w:b/>
           <w:color w:val="0F172A"/>
         </w:rPr>
-        <w:t>2. Unstructured Evaluation:</w:t>
+        <w:t>2. Mathematical Determinism:</w:t>
       </w:r>
       <w:r>
-        <w:t xml:space="preserve"> Traditional questionnaires present long, flat lists of unrelated questions without taking advantage of hierarchical domain narrowing.</w:t>
+        <w:t xml:space="preserve"> Partitioning an exponential search space into halves at each node, achieving O(log2 N) logarithmic inference efficiency.</w:t>
       </w:r>
     </w:p>
     <w:p>
@@ -392,39 +411,10 @@
           <w:b/>
           <w:color w:val="0F172A"/>
         </w:rPr>
-        <w:t>3. Absence of Backtracking &amp; Auditability:</w:t>
+        <w:t>3. Stack Data Structure:</w:t>
       </w:r>
       <w:r>
-        <w:t xml:space="preserve"> Users are unable to trace which precise responses led to a specific recommendation, nor can they dynamically backtrack, test 'what-if' alternatives, or inspect the underlying decision graph.</w:t>
-      </w:r>
-    </w:p>
-    <w:p>
-      <w:r>
-        <w:t>To solve this problem, there is a fundamental need for a deterministic, hierarchical, and mathematically grounded interactive career advisory engine built upon an explicit Binary Decision Tree data structure. Such an engine must systematically narrow down the search space in logarithmic time O(log2 N), maintain an auditable answer stack, support instant step-by-step backtracking, visualize the underlying tree graph, and deliver comprehensive career intelligence.</w:t>
-      </w:r>
-    </w:p>
-    <w:p>
-      <w:pPr>
-        <w:keepNext/>
-        <w:spacing w:before="280" w:after="80"/>
-      </w:pPr>
-      <w:r>
-        <w:rPr>
-          <w:b/>
-          <w:color w:val="0F172A"/>
-          <w:sz w:val="30"/>
-        </w:rPr>
-        <w:t>2. Motivation</w:t>
-      </w:r>
-    </w:p>
-    <w:p>
-      <w:r>
-        <w:t>Trees are foundational non-linear data structures in computer science, governing everything from file system hierarchies and database B-tree indexing to AST compilers and decision-support systems. Implementing an explicit binary decision tree provides an ideal pedagogical bridge connecting classical Data Structures and Algorithms (DSA) with real-world software engineering and human-computer interaction (HCI).</w:t>
-      </w:r>
-    </w:p>
-    <w:p>
-      <w:r>
-        <w:t>Key motivational drivers for this project include:</w:t>
+        <w:t xml:space="preserve"> Implementing an auxiliary Last-In, First-Out (LIFO) stack from scratch to enable O(1) state backtracking (Undo).</w:t>
       </w:r>
     </w:p>
     <w:p>
@@ -437,10 +427,10 @@
           <w:b/>
           <w:color w:val="0F172A"/>
         </w:rPr>
-        <w:t>Algorithmic Rigor:</w:t>
+        <w:t>4. Queue Data Structure:</w:t>
       </w:r>
       <w:r>
-        <w:t xml:space="preserve"> Demonstrating how an explicit Binary Tree with parent-child pointers (`yes` and `no`) splits an exponential problem space in half at each successive level, reducing search complexity from linear scanning O(N) to logarithmic traversal O(log2 N).</w:t>
+        <w:t xml:space="preserve"> Implementing a linked First-In, First-Out (FIFO) queue from scratch to execute Breadth-First Search (Level-Order BFS) traversal.</w:t>
       </w:r>
     </w:p>
     <w:p>
@@ -453,10 +443,365 @@
           <w:b/>
           <w:color w:val="0F172A"/>
         </w:rPr>
-        <w:t>Mathematical Determinism &amp; Explainability:</w:t>
+        <w:t>5. Memory Management Rigor:</w:t>
       </w:r>
       <w:r>
-        <w:t xml:space="preserve"> In critical life and academic decisions, deterministic transparency is paramount. Users can inspect every step of the decision path, guaranteeing complete explainability and auditability.</w:t>
+        <w:t xml:space="preserve"> Implementing recursive post-order tree destruction to free all 31 nodes and payloads, guaranteeing zero memory leaks.</w:t>
+      </w:r>
+    </w:p>
+    <w:p>
+      <w:pPr>
+        <w:keepNext/>
+        <w:spacing w:before="280" w:after="80"/>
+      </w:pPr>
+      <w:r>
+        <w:rPr>
+          <w:b/>
+          <w:color w:val="0F172A"/>
+          <w:sz w:val="29"/>
+        </w:rPr>
+        <w:t>3. Objectives</w:t>
+      </w:r>
+    </w:p>
+    <w:p>
+      <w:pPr>
+        <w:pStyle w:val="ListNumber"/>
+        <w:spacing w:after="40"/>
+      </w:pPr>
+      <w:r>
+        <w:rPr>
+          <w:b/>
+          <w:color w:val="0F172A"/>
+        </w:rPr>
+        <w:t xml:space="preserve">1. Object Modeling in C: </w:t>
+      </w:r>
+      <w:r>
+        <w:t>Design and implement an explicit `DecisionNode` structure in C with `yes` (left) and `no` (right) child pointer references.</w:t>
+      </w:r>
+    </w:p>
+    <w:p>
+      <w:pPr>
+        <w:pStyle w:val="ListNumber"/>
+        <w:spacing w:after="40"/>
+      </w:pPr>
+      <w:r>
+        <w:rPr>
+          <w:b/>
+          <w:color w:val="0F172A"/>
+        </w:rPr>
+        <w:t xml:space="preserve">2. Balanced Binary Tree: </w:t>
+      </w:r>
+      <w:r>
+        <w:t>Construct a balanced 4-level binary tree in heap memory consisting of 15 decision nodes and 16 career leaves (N = 31).</w:t>
+      </w:r>
+    </w:p>
+    <w:p>
+      <w:pPr>
+        <w:pStyle w:val="ListNumber"/>
+        <w:spacing w:after="40"/>
+      </w:pPr>
+      <w:r>
+        <w:rPr>
+          <w:b/>
+          <w:color w:val="0F172A"/>
+        </w:rPr>
+        <w:t xml:space="preserve">3. Logarithmic Inference: </w:t>
+      </w:r>
+      <w:r>
+        <w:t>Implement deterministic root-to-leaf traversal executing in exactly O(h) = 4 pointer dereferences.</w:t>
+      </w:r>
+    </w:p>
+    <w:p>
+      <w:pPr>
+        <w:pStyle w:val="ListNumber"/>
+        <w:spacing w:after="40"/>
+      </w:pPr>
+      <w:r>
+        <w:rPr>
+          <w:b/>
+          <w:color w:val="0F172A"/>
+        </w:rPr>
+        <w:t xml:space="preserve">4. Custom LIFO Stack: </w:t>
+      </w:r>
+      <w:r>
+        <w:t>Implement a custom LIFO Stack structure (`NodeStack`) to enable O(1) undo and state backtracking.</w:t>
+      </w:r>
+    </w:p>
+    <w:p>
+      <w:pPr>
+        <w:pStyle w:val="ListNumber"/>
+        <w:spacing w:after="40"/>
+      </w:pPr>
+      <w:r>
+        <w:rPr>
+          <w:b/>
+          <w:color w:val="0F172A"/>
+        </w:rPr>
+        <w:t xml:space="preserve">5. Custom FIFO Queue: </w:t>
+      </w:r>
+      <w:r>
+        <w:t>Implement a custom linked FIFO Queue structure (`Queue`) to perform Breadth-First Search (BFS) level-order traversal.</w:t>
+      </w:r>
+    </w:p>
+    <w:p>
+      <w:pPr>
+        <w:pStyle w:val="ListNumber"/>
+        <w:spacing w:after="40"/>
+      </w:pPr>
+      <w:r>
+        <w:rPr>
+          <w:b/>
+          <w:color w:val="0F172A"/>
+        </w:rPr>
+        <w:t xml:space="preserve">6. DFS with Backtracking: </w:t>
+      </w:r>
+      <w:r>
+        <w:t>Implement recursive Depth-First Search (DFS) with backtracking to discover paths to any target career.</w:t>
+      </w:r>
+    </w:p>
+    <w:p>
+      <w:pPr>
+        <w:pStyle w:val="ListNumber"/>
+        <w:spacing w:after="40"/>
+      </w:pPr>
+      <w:r>
+        <w:rPr>
+          <w:b/>
+          <w:color w:val="0F172A"/>
+        </w:rPr>
+        <w:t xml:space="preserve">7. Interactive CLI: </w:t>
+      </w:r>
+      <w:r>
+        <w:t>Develop a clean, interactive terminal interface with menu navigation, step progress, ASCII tree graphics, and file export.</w:t>
+      </w:r>
+    </w:p>
+    <w:p>
+      <w:pPr>
+        <w:pStyle w:val="ListNumber"/>
+        <w:spacing w:after="40"/>
+      </w:pPr>
+      <w:r>
+        <w:rPr>
+          <w:b/>
+          <w:color w:val="0F172A"/>
+        </w:rPr>
+        <w:t xml:space="preserve">8. Memory Safety: </w:t>
+      </w:r>
+      <w:r>
+        <w:t>Implement a post-order recursive tree destructor (`free_tree`) to eliminate all memory leaks.</w:t>
+      </w:r>
+    </w:p>
+    <w:p>
+      <w:pPr>
+        <w:pStyle w:val="ListNumber"/>
+        <w:spacing w:after="40"/>
+      </w:pPr>
+      <w:r>
+        <w:rPr>
+          <w:b/>
+          <w:color w:val="0F172A"/>
+        </w:rPr>
+        <w:t xml:space="preserve">9. Automated C Unit Tests: </w:t>
+      </w:r>
+      <w:r>
+        <w:t>Build an automated test suite in C verifying 100% path reachability across all 16 binary permutations.</w:t>
+      </w:r>
+    </w:p>
+    <w:p>
+      <w:pPr>
+        <w:keepNext/>
+        <w:spacing w:before="280" w:after="80"/>
+      </w:pPr>
+      <w:r>
+        <w:rPr>
+          <w:b/>
+          <w:color w:val="0F172A"/>
+          <w:sz w:val="29"/>
+        </w:rPr>
+        <w:t>4. Methodology / Implementation</w:t>
+      </w:r>
+    </w:p>
+    <w:p>
+      <w:r>
+        <w:t>The project follows a clean multi-file C architecture separating definitions (`tree.h`), algorithmic implementations (`tree.c`), and user interaction (`main.c`), automated via a `Makefile`.</w:t>
+      </w:r>
+    </w:p>
+    <w:p>
+      <w:pPr>
+        <w:keepNext/>
+        <w:spacing w:before="180" w:after="60"/>
+      </w:pPr>
+      <w:r>
+        <w:rPr>
+          <w:b/>
+          <w:color w:val="0D9488"/>
+          <w:sz w:val="24"/>
+        </w:rPr>
+        <w:t>4.1 Node &amp; Payload Data Structures (`tree.h`)</w:t>
+      </w:r>
+    </w:p>
+    <w:p>
+      <w:pPr>
+        <w:spacing w:before="60" w:after="60"/>
+        <w:ind w:left="360"/>
+      </w:pPr>
+      <w:r>
+        <w:rPr>
+          <w:rFonts w:ascii="Consolas" w:hAnsi="Consolas"/>
+          <w:color w:val="1E293B"/>
+          <w:sz w:val="18"/>
+        </w:rPr>
+        <w:t>typedef struct CareerProfile {</w:t>
+        <w:br/>
+        <w:t xml:space="preserve">    char title[128];</w:t>
+        <w:br/>
+        <w:t xml:space="preserve">    char category[64];</w:t>
+        <w:br/>
+        <w:t xml:space="preserve">    char tagline[256];</w:t>
+        <w:br/>
+        <w:t xml:space="preserve">    char overview[512];</w:t>
+        <w:br/>
+        <w:t xml:space="preserve">    char why_match[512];</w:t>
+        <w:br/>
+        <w:t xml:space="preserve">    char skills[6][64]; int skill_count;</w:t>
+        <w:br/>
+        <w:t xml:space="preserve">    char tools[6][64];  int tool_count;</w:t>
+        <w:br/>
+        <w:t xml:space="preserve">    char salary_range[64];</w:t>
+        <w:br/>
+        <w:t xml:space="preserve">    char growth_outlook[64];</w:t>
+        <w:br/>
+        <w:t xml:space="preserve">    char roadmap_foundational[512];</w:t>
+        <w:br/>
+        <w:t xml:space="preserve">    char roadmap_intermediate[512];</w:t>
+        <w:br/>
+        <w:t xml:space="preserve">    char roadmap_advanced[512];</w:t>
+        <w:br/>
+        <w:t>} CareerProfile;</w:t>
+        <w:br/>
+        <w:br/>
+        <w:t>typedef struct DecisionNode {</w:t>
+        <w:br/>
+        <w:t xml:space="preserve">    char question[512];</w:t>
+        <w:br/>
+        <w:t xml:space="preserve">    char context_tip[512];</w:t>
+        <w:br/>
+        <w:t xml:space="preserve">    struct DecisionNode* yes;   /* Left pointer (YES branch) */</w:t>
+        <w:br/>
+        <w:t xml:space="preserve">    struct DecisionNode* no;    /* Right pointer (NO branch) */</w:t>
+        <w:br/>
+        <w:t xml:space="preserve">    CareerProfile* career;      /* Leaf payload (NULL if internal) */</w:t>
+        <w:br/>
+        <w:t xml:space="preserve">    char node_id[32];</w:t>
+        <w:br/>
+        <w:t>} DecisionNode;</w:t>
+      </w:r>
+    </w:p>
+    <w:p>
+      <w:pPr>
+        <w:keepNext/>
+        <w:spacing w:before="180" w:after="60"/>
+      </w:pPr>
+      <w:r>
+        <w:rPr>
+          <w:b/>
+          <w:color w:val="0D9488"/>
+          <w:sz w:val="24"/>
+        </w:rPr>
+        <w:t>4.2 LIFO Stack Structure for Backtracking</w:t>
+      </w:r>
+    </w:p>
+    <w:p>
+      <w:pPr>
+        <w:spacing w:before="60" w:after="60"/>
+        <w:ind w:left="360"/>
+      </w:pPr>
+      <w:r>
+        <w:rPr>
+          <w:rFonts w:ascii="Consolas" w:hAnsi="Consolas"/>
+          <w:color w:val="1E293B"/>
+          <w:sz w:val="18"/>
+        </w:rPr>
+        <w:t>typedef struct NodeStack {</w:t>
+        <w:br/>
+        <w:t xml:space="preserve">    DecisionNode* nodes[32];</w:t>
+        <w:br/>
+        <w:t xml:space="preserve">    int answers[32];</w:t>
+        <w:br/>
+        <w:t xml:space="preserve">    int top;</w:t>
+        <w:br/>
+        <w:t>} NodeStack;</w:t>
+      </w:r>
+    </w:p>
+    <w:p>
+      <w:r>
+        <w:t>When advancing, `stack_push(&amp;stack, current, answer)` pushes the node reference. When clicking 'Undo', `stack_pop(&amp;stack, &amp;answer)` pops the node in O(1) time, restoring the parent reference.</w:t>
+      </w:r>
+    </w:p>
+    <w:p>
+      <w:pPr>
+        <w:keepNext/>
+        <w:spacing w:before="180" w:after="60"/>
+      </w:pPr>
+      <w:r>
+        <w:rPr>
+          <w:b/>
+          <w:color w:val="0D9488"/>
+          <w:sz w:val="24"/>
+        </w:rPr>
+        <w:t>4.3 FIFO Queue Structure for Level-Order BFS</w:t>
+      </w:r>
+    </w:p>
+    <w:p>
+      <w:pPr>
+        <w:spacing w:before="60" w:after="60"/>
+        <w:ind w:left="360"/>
+      </w:pPr>
+      <w:r>
+        <w:rPr>
+          <w:rFonts w:ascii="Consolas" w:hAnsi="Consolas"/>
+          <w:color w:val="1E293B"/>
+          <w:sz w:val="18"/>
+        </w:rPr>
+        <w:t>typedef struct QueueNode {</w:t>
+        <w:br/>
+        <w:t xml:space="preserve">    DecisionNode* tree_node;</w:t>
+        <w:br/>
+        <w:t xml:space="preserve">    int level;</w:t>
+        <w:br/>
+        <w:t xml:space="preserve">    struct QueueNode* next;</w:t>
+        <w:br/>
+        <w:t>} QueueNode;</w:t>
+        <w:br/>
+        <w:br/>
+        <w:t>typedef struct Queue {</w:t>
+        <w:br/>
+        <w:t xml:space="preserve">    QueueNode* front;</w:t>
+        <w:br/>
+        <w:t xml:space="preserve">    QueueNode* rear;</w:t>
+        <w:br/>
+        <w:t xml:space="preserve">    int size;</w:t>
+        <w:br/>
+        <w:t>} Queue;</w:t>
+      </w:r>
+    </w:p>
+    <w:p>
+      <w:pPr>
+        <w:keepNext/>
+        <w:spacing w:before="280" w:after="80"/>
+      </w:pPr>
+      <w:r>
+        <w:rPr>
+          <w:b/>
+          <w:color w:val="0F172A"/>
+          <w:sz w:val="29"/>
+        </w:rPr>
+        <w:t>5. Hardware / Software Used</w:t>
+      </w:r>
+    </w:p>
+    <w:p>
+      <w:r>
+        <w:t>The development and execution environment utilized the following specifications:</w:t>
       </w:r>
     </w:p>
     <w:p>
@@ -469,623 +814,10 @@
           <w:b/>
           <w:color w:val="0F172A"/>
         </w:rPr>
-        <w:t>Interactive State Management:</w:t>
+        <w:t>Hardware:</w:t>
       </w:r>
       <w:r>
-        <w:t xml:space="preserve"> Utilizing a stack data structure (LIFO) in conjunction with the tree to record decision breadcrumbs, enabling instantaneous undo operations, history tracking, and path reconstruction.</w:t>
-      </w:r>
-    </w:p>
-    <w:p>
-      <w:pPr>
-        <w:pStyle w:val="ListBullet"/>
-        <w:spacing w:after="40"/>
-      </w:pPr>
-      <w:r>
-        <w:rPr>
-          <w:b/>
-          <w:color w:val="0F172A"/>
-        </w:rPr>
-        <w:t>Practical Impact:</w:t>
-      </w:r>
-      <w:r>
-        <w:t xml:space="preserve"> Delivering a production-quality, open-source Streamlit application accompanied by Matplotlib graph visualizers, unit testing suites, and curated career intelligence roadmaps to showcase engineering excellence.</w:t>
-      </w:r>
-    </w:p>
-    <w:p>
-      <w:pPr>
-        <w:keepNext/>
-        <w:spacing w:before="280" w:after="80"/>
-      </w:pPr>
-      <w:r>
-        <w:rPr>
-          <w:b/>
-          <w:color w:val="0F172A"/>
-          <w:sz w:val="30"/>
-        </w:rPr>
-        <w:t>3. Objectives</w:t>
-      </w:r>
-    </w:p>
-    <w:p>
-      <w:r>
-        <w:t>The core technical and architectural objectives of this mini-project are:</w:t>
-      </w:r>
-    </w:p>
-    <w:p>
-      <w:pPr>
-        <w:pStyle w:val="ListNumber"/>
-        <w:spacing w:after="40"/>
-      </w:pPr>
-      <w:r>
-        <w:rPr>
-          <w:b/>
-          <w:color w:val="0F172A"/>
-        </w:rPr>
-        <w:t xml:space="preserve">1. Object-Oriented Binary Node Architecture: </w:t>
-      </w:r>
-      <w:r>
-        <w:t>Design and implement an explicit `DecisionNode` class with dedicated `yes` (left) and `no` (right) child pointer references, encapsulation methods, and properties.</w:t>
-      </w:r>
-    </w:p>
-    <w:p>
-      <w:pPr>
-        <w:pStyle w:val="ListNumber"/>
-        <w:spacing w:after="40"/>
-      </w:pPr>
-      <w:r>
-        <w:rPr>
-          <w:b/>
-          <w:color w:val="0F172A"/>
-        </w:rPr>
-        <w:t xml:space="preserve">2. 16-Pathway Career Tree Hierarchy: </w:t>
-      </w:r>
-      <w:r>
-        <w:t>Construct a balanced 4-level binary decision tree consisting of 15 internal decision nodes and 16 distinct high-growth career leaf profiles.</w:t>
-      </w:r>
-    </w:p>
-    <w:p>
-      <w:pPr>
-        <w:pStyle w:val="ListNumber"/>
-        <w:spacing w:after="40"/>
-      </w:pPr>
-      <w:r>
-        <w:rPr>
-          <w:b/>
-          <w:color w:val="0F172A"/>
-        </w:rPr>
-        <w:t xml:space="preserve">3. Logarithmic Inference Traversal: </w:t>
-      </w:r>
-      <w:r>
-        <w:t>Implement deterministic root-to-leaf traversal executing in O(h) = O(log2 N) time complexity, where h = 4.</w:t>
-      </w:r>
-    </w:p>
-    <w:p>
-      <w:pPr>
-        <w:pStyle w:val="ListNumber"/>
-        <w:spacing w:after="40"/>
-      </w:pPr>
-      <w:r>
-        <w:rPr>
-          <w:b/>
-          <w:color w:val="0F172A"/>
-        </w:rPr>
-        <w:t xml:space="preserve">4. Stack-Based Backtracking: </w:t>
-      </w:r>
-      <w:r>
-        <w:t>Implement dynamic stack-based backtracking (Undo) and state reset mechanisms allowing users to reverse decisions without restarting.</w:t>
-      </w:r>
-    </w:p>
-    <w:p>
-      <w:pPr>
-        <w:pStyle w:val="ListNumber"/>
-        <w:spacing w:after="40"/>
-      </w:pPr>
-      <w:r>
-        <w:rPr>
-          <w:b/>
-          <w:color w:val="0F172A"/>
-        </w:rPr>
-        <w:t xml:space="preserve">5. Target Path Search (DFS): </w:t>
-      </w:r>
-      <w:r>
-        <w:t>Implement Depth-First Search (DFS) algorithms to locate and trace the exact decision sequence leading to any chosen target career.</w:t>
-      </w:r>
-    </w:p>
-    <w:p>
-      <w:pPr>
-        <w:pStyle w:val="ListNumber"/>
-        <w:spacing w:after="40"/>
-      </w:pPr>
-      <w:r>
-        <w:rPr>
-          <w:b/>
-          <w:color w:val="0F172A"/>
-        </w:rPr>
-        <w:t xml:space="preserve">6. Tree Traversal Demonstrations: </w:t>
-      </w:r>
-      <w:r>
-        <w:t>Implement Breadth-First Search (Level-Order BFS), Pre-Order DFS, and In-Order DFS traversal algorithms to demonstrate core DSA operations.</w:t>
-      </w:r>
-    </w:p>
-    <w:p>
-      <w:pPr>
-        <w:pStyle w:val="ListNumber"/>
-        <w:spacing w:after="40"/>
-      </w:pPr>
-      <w:r>
-        <w:rPr>
-          <w:b/>
-          <w:color w:val="0F172A"/>
-        </w:rPr>
-        <w:t xml:space="preserve">7. Graph Visualization: </w:t>
-      </w:r>
-      <w:r>
-        <w:t>Render high-resolution visual tree diagrams with edge decision labels and real-time path highlighting using Matplotlib.</w:t>
-      </w:r>
-    </w:p>
-    <w:p>
-      <w:pPr>
-        <w:pStyle w:val="ListNumber"/>
-        <w:spacing w:after="40"/>
-      </w:pPr>
-      <w:r>
-        <w:rPr>
-          <w:b/>
-          <w:color w:val="0F172A"/>
-        </w:rPr>
-        <w:t xml:space="preserve">8. Responsive Web UI: </w:t>
-      </w:r>
-      <w:r>
-        <w:t>Develop an interactive, modern web application using Streamlit featuring progress trackers, contextual assessment tips, and searchable career directories.</w:t>
-      </w:r>
-    </w:p>
-    <w:p>
-      <w:pPr>
-        <w:pStyle w:val="ListNumber"/>
-        <w:spacing w:after="40"/>
-      </w:pPr>
-      <w:r>
-        <w:rPr>
-          <w:b/>
-          <w:color w:val="0F172A"/>
-        </w:rPr>
-        <w:t xml:space="preserve">9. Career Intelligence &amp; Export: </w:t>
-      </w:r>
-      <w:r>
-        <w:t>Provide curated career intelligence dossiers including compensation bands, industry demand projections, certifications, and 3-stage learning roadmaps with one-click Markdown export.</w:t>
-      </w:r>
-    </w:p>
-    <w:p>
-      <w:pPr>
-        <w:pStyle w:val="ListNumber"/>
-        <w:spacing w:after="40"/>
-      </w:pPr>
-      <w:r>
-        <w:rPr>
-          <w:b/>
-          <w:color w:val="0F172A"/>
-        </w:rPr>
-        <w:t xml:space="preserve">10. Automated Testing &amp; Deployment: </w:t>
-      </w:r>
-      <w:r>
-        <w:t>Establish automated unit tests validating 100% path reachability, node counts, tree balance, and publish the codebase to GitHub.</w:t>
-      </w:r>
-    </w:p>
-    <w:p>
-      <w:pPr>
-        <w:keepNext/>
-        <w:spacing w:before="280" w:after="80"/>
-      </w:pPr>
-      <w:r>
-        <w:rPr>
-          <w:b/>
-          <w:color w:val="0F172A"/>
-          <w:sz w:val="30"/>
-        </w:rPr>
-        <w:t>4. Methodology / Implementation</w:t>
-      </w:r>
-    </w:p>
-    <w:p>
-      <w:r>
-        <w:t>The application follows a clean, decoupled modular architecture separating the data structure and algorithms engine (`tree.py`) from the presentation and user interaction layer (`app.py`), with automated verification (`test_tree.py`).</w:t>
-      </w:r>
-    </w:p>
-    <w:p>
-      <w:pPr>
-        <w:keepNext/>
-        <w:spacing w:before="200" w:after="60"/>
-      </w:pPr>
-      <w:r>
-        <w:rPr>
-          <w:b/>
-          <w:color w:val="0D9488"/>
-          <w:sz w:val="25"/>
-        </w:rPr>
-        <w:t>4.1 Modular System Architecture</w:t>
-      </w:r>
-    </w:p>
-    <w:p>
-      <w:r>
-        <w:t>The project is structured into three specialized modules:</w:t>
-      </w:r>
-    </w:p>
-    <w:p>
-      <w:pPr>
-        <w:pStyle w:val="ListBullet"/>
-        <w:spacing w:after="40"/>
-      </w:pPr>
-      <w:r>
-        <w:rPr>
-          <w:b/>
-          <w:color w:val="0F172A"/>
-        </w:rPr>
-        <w:t>1. Core Engine (tree.py):</w:t>
-      </w:r>
-      <w:r>
-        <w:t xml:space="preserve"> Contains the `DecisionNode` class, `CareerProfile` dataclass, tree construction logic, BFS/DFS traversal algorithms, path searching, complexity metrics, and Matplotlib layout rendering functions.</w:t>
-      </w:r>
-    </w:p>
-    <w:p>
-      <w:pPr>
-        <w:pStyle w:val="ListBullet"/>
-        <w:spacing w:after="40"/>
-      </w:pPr>
-      <w:r>
-        <w:rPr>
-          <w:b/>
-          <w:color w:val="0F172A"/>
-        </w:rPr>
-        <w:t>2. Presentation UI (app.py):</w:t>
-      </w:r>
-      <w:r>
-        <w:t xml:space="preserve"> Built with Streamlit, handling interactive session state (`answers` and `node_stack`), dynamic UI rendering, tabbed navigation, breadcrumb tracking, and report file generation.</w:t>
-      </w:r>
-    </w:p>
-    <w:p>
-      <w:pPr>
-        <w:pStyle w:val="ListBullet"/>
-        <w:spacing w:after="40"/>
-      </w:pPr>
-      <w:r>
-        <w:rPr>
-          <w:b/>
-          <w:color w:val="0F172A"/>
-        </w:rPr>
-        <w:t>3. Test Suite (test_tree.py):</w:t>
-      </w:r>
-      <w:r>
-        <w:t xml:space="preserve"> Built with `unittest`, verifying tree height, node counts, perfect balance, and 100% reachability across all 16 binary permutations.</w:t>
-      </w:r>
-    </w:p>
-    <w:p>
-      <w:pPr>
-        <w:keepNext/>
-        <w:spacing w:before="200" w:after="60"/>
-      </w:pPr>
-      <w:r>
-        <w:rPr>
-          <w:b/>
-          <w:color w:val="0D9488"/>
-          <w:sz w:val="25"/>
-        </w:rPr>
-        <w:t>4.2 Data Representation &amp; Node Class Structure</w:t>
-      </w:r>
-    </w:p>
-    <w:p>
-      <w:r>
-        <w:t>Each internal node in the binary decision tree contains a question string, an assessment contextual tip, and two child references (`yes` and `no`). Each leaf node contains a `CareerProfile` object encapsulating comprehensive domain metadata:</w:t>
-      </w:r>
-    </w:p>
-    <w:p>
-      <w:pPr>
-        <w:spacing w:before="80" w:after="80"/>
-        <w:ind w:left="432"/>
-      </w:pPr>
-      <w:r>
-        <w:rPr>
-          <w:rFonts w:ascii="Consolas" w:hAnsi="Consolas"/>
-          <w:color w:val="1E293B"/>
-          <w:sz w:val="19"/>
-        </w:rPr>
-        <w:t>class DecisionNode:</w:t>
-        <w:br/>
-        <w:t xml:space="preserve">    def __init__(self, question=None, context_tip=None, yes=None, no=None, career=None, node_id=None):</w:t>
-        <w:br/>
-        <w:t xml:space="preserve">        self.question = question       # Assessment question string (internal node)</w:t>
-        <w:br/>
-        <w:t xml:space="preserve">        self.context_tip = context_tip   # Contextual guidance for the user</w:t>
-        <w:br/>
-        <w:t xml:space="preserve">        self.yes = yes                 # Reference to left child (Yes branch)</w:t>
-        <w:br/>
-        <w:t xml:space="preserve">        self.no = no                   # Reference to right child (No branch)</w:t>
-        <w:br/>
-        <w:t xml:space="preserve">        self.career = career           # CareerProfile object (leaf node)</w:t>
-        <w:br/>
-        <w:t xml:space="preserve">        self.node_id = node_id         # Unique identifier string</w:t>
-        <w:br/>
-        <w:br/>
-        <w:t xml:space="preserve">    @property</w:t>
-        <w:br/>
-        <w:t xml:space="preserve">    def is_leaf(self) -&gt; bool:</w:t>
-        <w:br/>
-        <w:t xml:space="preserve">        return self.career is not None</w:t>
-        <w:br/>
-        <w:br/>
-        <w:t xml:space="preserve">    def count_nodes(self) -&gt; int:</w:t>
-        <w:br/>
-        <w:t xml:space="preserve">        if self.is_leaf: return 1</w:t>
-        <w:br/>
-        <w:t xml:space="preserve">        return 1 + (self.yes.count_nodes() if self.yes else 0) + (self.no.count_nodes() if self.no else 0)</w:t>
-        <w:br/>
-        <w:br/>
-        <w:t xml:space="preserve">    def get_height(self) -&gt; int:</w:t>
-        <w:br/>
-        <w:t xml:space="preserve">        if self.is_leaf: return 0</w:t>
-        <w:br/>
-        <w:t xml:space="preserve">        return 1 + max(self.yes.get_height() if self.yes else 0, self.no.get_height() if self.no else 0)</w:t>
-      </w:r>
-    </w:p>
-    <w:p>
-      <w:pPr>
-        <w:keepNext/>
-        <w:spacing w:before="200" w:after="60"/>
-      </w:pPr>
-      <w:r>
-        <w:rPr>
-          <w:b/>
-          <w:color w:val="0D9488"/>
-          <w:sz w:val="25"/>
-        </w:rPr>
-        <w:t>4.3 4-Level Binary Decision Hierarchy</w:t>
-      </w:r>
-    </w:p>
-    <w:p>
-      <w:r>
-        <w:t>The tree is organized across 4 distinct hierarchical decision levels, systematically pruning unselected branches:</w:t>
-      </w:r>
-    </w:p>
-    <w:p>
-      <w:pPr>
-        <w:pStyle w:val="ListBullet"/>
-        <w:spacing w:after="40"/>
-      </w:pPr>
-      <w:r>
-        <w:rPr>
-          <w:b/>
-          <w:color w:val="0F172A"/>
-        </w:rPr>
-        <w:t>Level 1 (Domain Selection):</w:t>
-      </w:r>
-      <w:r>
-        <w:t xml:space="preserve"> Root Question distinguishing Technical &amp; Analytical Systems from Creative, Human-Centric, &amp; Strategic Domains.</w:t>
-      </w:r>
-    </w:p>
-    <w:p>
-      <w:pPr>
-        <w:pStyle w:val="ListBullet"/>
-        <w:spacing w:after="40"/>
-      </w:pPr>
-      <w:r>
-        <w:rPr>
-          <w:b/>
-          <w:color w:val="0F172A"/>
-        </w:rPr>
-        <w:t>Level 2 (Discipline Specialization):</w:t>
-      </w:r>
-      <w:r>
-        <w:t xml:space="preserve"> Evaluates Software &amp; Infrastructure vs. Data &amp; AI (Technical branch) OR Visual &amp; Spatial Design vs. Product Strategy &amp; Leadership (Creative branch).</w:t>
-      </w:r>
-    </w:p>
-    <w:p>
-      <w:pPr>
-        <w:pStyle w:val="ListBullet"/>
-        <w:spacing w:after="40"/>
-      </w:pPr>
-      <w:r>
-        <w:rPr>
-          <w:b/>
-          <w:color w:val="0F172A"/>
-        </w:rPr>
-        <w:t>Level 3 (Functional Focus):</w:t>
-      </w:r>
-      <w:r>
-        <w:t xml:space="preserve"> Evaluates Backend/Security vs. Applications/Games, Deep Learning vs. Applied Analytics, Interface Ergonomics vs. Spatial XR, or Product Vision vs. Community/Education.</w:t>
-      </w:r>
-    </w:p>
-    <w:p>
-      <w:pPr>
-        <w:pStyle w:val="ListBullet"/>
-        <w:spacing w:after="40"/>
-      </w:pPr>
-      <w:r>
-        <w:rPr>
-          <w:b/>
-          <w:color w:val="0F172A"/>
-        </w:rPr>
-        <w:t>Level 4 (Role Specialization):</w:t>
-      </w:r>
-      <w:r>
-        <w:t xml:space="preserve"> Evaluates targeted role specializations, leading directly to the 16 terminal career leaves.</w:t>
-      </w:r>
-    </w:p>
-    <w:p>
-      <w:pPr>
-        <w:keepNext/>
-        <w:spacing w:before="200" w:after="60"/>
-      </w:pPr>
-      <w:r>
-        <w:rPr>
-          <w:b/>
-          <w:color w:val="0D9488"/>
-          <w:sz w:val="25"/>
-        </w:rPr>
-        <w:t>4.4 Session State &amp; Backtracking Management</w:t>
-      </w:r>
-    </w:p>
-    <w:p>
-      <w:r>
-        <w:t>User progress is tracked using Streamlit's `st.session_state` with two synchronized collections:</w:t>
-      </w:r>
-    </w:p>
-    <w:p>
-      <w:pPr>
-        <w:pStyle w:val="ListBullet"/>
-        <w:spacing w:after="40"/>
-      </w:pPr>
-      <w:r>
-        <w:rPr>
-          <w:b/>
-          <w:color w:val="0F172A"/>
-        </w:rPr>
-        <w:t>1. Answer Stack (st.session_state.answers):</w:t>
-      </w:r>
-      <w:r>
-        <w:t xml:space="preserve"> A list of boolean values `[True, False, ...]` recording the exact chronological choices made by the user.</w:t>
-      </w:r>
-    </w:p>
-    <w:p>
-      <w:pPr>
-        <w:pStyle w:val="ListBullet"/>
-        <w:spacing w:after="40"/>
-      </w:pPr>
-      <w:r>
-        <w:rPr>
-          <w:b/>
-          <w:color w:val="0F172A"/>
-        </w:rPr>
-        <w:t>2. Node Stack (st.session_state.node_stack):</w:t>
-      </w:r>
-      <w:r>
-        <w:t xml:space="preserve"> An auxiliary stack of `DecisionNode` references `[root, node_L1, node_L2, ...]`. When the user clicks 'Undo', the top elements are popped from both stacks, reverting the system state to the exact preceding node in O(1) time.</w:t>
-      </w:r>
-    </w:p>
-    <w:p>
-      <w:pPr>
-        <w:keepNext/>
-        <w:spacing w:before="200" w:after="60"/>
-      </w:pPr>
-      <w:r>
-        <w:rPr>
-          <w:b/>
-          <w:color w:val="0D9488"/>
-          <w:sz w:val="25"/>
-        </w:rPr>
-        <w:t>4.5 Graphical Layout Generation Algorithm</w:t>
-      </w:r>
-    </w:p>
-    <w:p>
-      <w:r>
-        <w:t>The visual tree graph is rendered using a recursive layout algorithm in `tree.py`. Leaf nodes are placed sequentially along the X-axis from x = 0 to 15 at y = -4. Parent node X-coordinates are recursively computed as the arithmetic mean of their two children: x_parent = (x_left + x_right) / 2. Edges are drawn with connecting line segments, labeled with 'Yes' and 'No' bounding boxes, and dynamically colored based on the active traversal path.</w:t>
-      </w:r>
-    </w:p>
-    <w:p>
-      <w:pPr>
-        <w:keepNext/>
-        <w:spacing w:before="280" w:after="80"/>
-      </w:pPr>
-      <w:r>
-        <w:rPr>
-          <w:b/>
-          <w:color w:val="0F172A"/>
-          <w:sz w:val="30"/>
-        </w:rPr>
-        <w:t>5. Hardware / Software Used</w:t>
-      </w:r>
-    </w:p>
-    <w:p>
-      <w:r>
-        <w:t>The development, execution, and testing environment utilized the following specifications:</w:t>
-      </w:r>
-    </w:p>
-    <w:p>
-      <w:pPr>
-        <w:keepNext/>
-        <w:spacing w:before="200" w:after="60"/>
-      </w:pPr>
-      <w:r>
-        <w:rPr>
-          <w:b/>
-          <w:color w:val="0D9488"/>
-          <w:sz w:val="25"/>
-        </w:rPr>
-        <w:t>5.1 Hardware Specifications</w:t>
-      </w:r>
-    </w:p>
-    <w:p>
-      <w:pPr>
-        <w:pStyle w:val="ListBullet"/>
-        <w:spacing w:after="40"/>
-      </w:pPr>
-      <w:r>
-        <w:rPr>
-          <w:b/>
-          <w:color w:val="0F172A"/>
-        </w:rPr>
-        <w:t>Processor:</w:t>
-      </w:r>
-      <w:r>
-        <w:t xml:space="preserve"> Standard x86-64 multi-core processor (Intel Core i3/i5/i7 or AMD Ryzen series).</w:t>
-      </w:r>
-    </w:p>
-    <w:p>
-      <w:pPr>
-        <w:pStyle w:val="ListBullet"/>
-        <w:spacing w:after="40"/>
-      </w:pPr>
-      <w:r>
-        <w:rPr>
-          <w:b/>
-          <w:color w:val="0F172A"/>
-        </w:rPr>
-        <w:t>Primary Memory (RAM):</w:t>
-      </w:r>
-      <w:r>
-        <w:t xml:space="preserve"> 4 GB RAM minimum (8 GB recommended for concurrent browser and Matplotlib rendering).</w:t>
-      </w:r>
-    </w:p>
-    <w:p>
-      <w:pPr>
-        <w:pStyle w:val="ListBullet"/>
-        <w:spacing w:after="40"/>
-      </w:pPr>
-      <w:r>
-        <w:rPr>
-          <w:b/>
-          <w:color w:val="0F172A"/>
-        </w:rPr>
-        <w:t>Storage:</w:t>
-      </w:r>
-      <w:r>
-        <w:t xml:space="preserve"> 500 MB free space for code repository, virtual environment, and generated artifacts.</w:t>
-      </w:r>
-    </w:p>
-    <w:p>
-      <w:pPr>
-        <w:pStyle w:val="ListBullet"/>
-        <w:spacing w:after="40"/>
-      </w:pPr>
-      <w:r>
-        <w:rPr>
-          <w:b/>
-          <w:color w:val="0F172A"/>
-        </w:rPr>
-        <w:t>Display:</w:t>
-      </w:r>
-      <w:r>
-        <w:t xml:space="preserve"> 1080p (1920x1080) or higher resolution recommended for wide tree graph visualization.</w:t>
-      </w:r>
-    </w:p>
-    <w:p>
-      <w:pPr>
-        <w:keepNext/>
-        <w:spacing w:before="200" w:after="60"/>
-      </w:pPr>
-      <w:r>
-        <w:rPr>
-          <w:b/>
-          <w:color w:val="0D9488"/>
-          <w:sz w:val="25"/>
-        </w:rPr>
-        <w:t>5.2 Software Specifications</w:t>
+        <w:t xml:space="preserve"> Any standard x86-64 multi-core processor (Intel Core i3/i5/i7 or AMD Ryzen).</w:t>
       </w:r>
     </w:p>
     <w:p>
@@ -1101,7 +833,7 @@
         <w:t>Operating System:</w:t>
       </w:r>
       <w:r>
-        <w:t xml:space="preserve"> Microsoft Windows 11 / Windows 10 (compatible with macOS and Linux distributions).</w:t>
+        <w:t xml:space="preserve"> Windows 11 / Windows 10 (fully portable to Linux and macOS).</w:t>
       </w:r>
     </w:p>
     <w:p>
@@ -1114,10 +846,10 @@
           <w:b/>
           <w:color w:val="0F172A"/>
         </w:rPr>
-        <w:t>Programming Language:</w:t>
+        <w:t>Language:</w:t>
       </w:r>
       <w:r>
-        <w:t xml:space="preserve"> Python 3.14.0 (compatible with Python 3.10 and newer).</w:t>
+        <w:t xml:space="preserve"> C (C99 standard, conforming to ISO/IEC 9899:1999).</w:t>
       </w:r>
     </w:p>
     <w:p>
@@ -1130,10 +862,10 @@
           <w:b/>
           <w:color w:val="0F172A"/>
         </w:rPr>
-        <w:t>Web Application Framework:</w:t>
+        <w:t>Compiler:</w:t>
       </w:r>
       <w:r>
-        <w:t xml:space="preserve"> Streamlit v1.59.2 (interactive web interface, reactive session state, component styling).</w:t>
+        <w:t xml:space="preserve"> GCC (Rev13, Built by MSYS2 project) 15.2.0 with `-Wall -Wextra -O2` flags.</w:t>
       </w:r>
     </w:p>
     <w:p>
@@ -1146,10 +878,10 @@
           <w:b/>
           <w:color w:val="0F172A"/>
         </w:rPr>
-        <w:t>Data Visualization:</w:t>
+        <w:t>Build Tool:</w:t>
       </w:r>
       <w:r>
-        <w:t xml:space="preserve"> Matplotlib v3.11.2 (graphical rendering of tree nodes, coordinate layout, path highlighting).</w:t>
+        <w:t xml:space="preserve"> GNU Make / Windows PowerShell.</w:t>
       </w:r>
     </w:p>
     <w:p>
@@ -1162,10 +894,10 @@
           <w:b/>
           <w:color w:val="0F172A"/>
         </w:rPr>
-        <w:t>Image Processing:</w:t>
+        <w:t>Development Environment:</w:t>
       </w:r>
       <w:r>
-        <w:t xml:space="preserve"> Pillow (PIL) v12.3.0 (image asset processing, diagram rasterization).</w:t>
+        <w:t xml:space="preserve"> Visual Studio Code, Git, GitHub.</w:t>
       </w:r>
     </w:p>
     <w:p>
@@ -1178,39 +910,7 @@
           <w:b/>
           <w:color w:val="0F172A"/>
         </w:rPr>
-        <w:t>Document Generation:</w:t>
-      </w:r>
-      <w:r>
-        <w:t xml:space="preserve"> python-docx v1.2.0 (programmatic generation of comprehensive project reports).</w:t>
-      </w:r>
-    </w:p>
-    <w:p>
-      <w:pPr>
-        <w:pStyle w:val="ListBullet"/>
-        <w:spacing w:after="40"/>
-      </w:pPr>
-      <w:r>
-        <w:rPr>
-          <w:b/>
-          <w:color w:val="0F172A"/>
-        </w:rPr>
-        <w:t>Development &amp; Version Control:</w:t>
-      </w:r>
-      <w:r>
-        <w:t xml:space="preserve"> Visual Studio Code, Git v2.47+, Windows PowerShell, GitHub.</w:t>
-      </w:r>
-    </w:p>
-    <w:p>
-      <w:pPr>
-        <w:pStyle w:val="ListBullet"/>
-        <w:spacing w:after="40"/>
-      </w:pPr>
-      <w:r>
-        <w:rPr>
-          <w:b/>
-          <w:color w:val="0F172A"/>
-        </w:rPr>
-        <w:t>Official Repository:</w:t>
+        <w:t>Repository:</w:t>
       </w:r>
       <w:r>
         <w:t xml:space="preserve"> https://github.com/bshubhayu07/career-tree</w:t>
@@ -1225,7 +925,7 @@
         <w:rPr>
           <w:b/>
           <w:color w:val="0F172A"/>
-          <w:sz w:val="30"/>
+          <w:sz w:val="29"/>
         </w:rPr>
         <w:t>6. Algorithm / Operations Implemented</w:t>
       </w:r>
@@ -1233,299 +933,155 @@
     <w:p>
       <w:pPr>
         <w:keepNext/>
-        <w:spacing w:before="200" w:after="60"/>
+        <w:spacing w:before="180" w:after="60"/>
       </w:pPr>
       <w:r>
         <w:rPr>
           <w:b/>
           <w:color w:val="0D9488"/>
-          <w:sz w:val="25"/>
+          <w:sz w:val="24"/>
         </w:rPr>
-        <w:t>6.1 Tree Construction Algorithm (Bottom-Up Assembly)</w:t>
+        <w:t>6.1 Bottom-Up Tree Construction (`build_career_tree`)</w:t>
       </w:r>
     </w:p>
     <w:p>
       <w:r>
-        <w:t>The tree is built deterministically in `build_career_tree()`. First, 16 terminal `DecisionNode` instances are created, each initialized with a complete `CareerProfile`. Next, 8 Level-4 decision nodes are created, linking their `yes` and `no` pointers to the appropriate leaves. This process repeats through Level 3 and Level 2 up to the single root node. This bottom-up instantiation ensures that all pointers are immutable and valid.</w:t>
+        <w:t>In C, child nodes must be allocated in heap memory before a parent can point to them. The tree is built bottom-up: first all 16 `CareerProfile` structures and leaf nodes are instantiated, then 8 Level-4 decision nodes are created linking `yes` and `no` to the leaves. This repeats for Level 3 and Level 2, culminating in the single root node.</w:t>
       </w:r>
     </w:p>
     <w:p>
       <w:pPr>
         <w:keepNext/>
-        <w:spacing w:before="200" w:after="60"/>
+        <w:spacing w:before="180" w:after="60"/>
       </w:pPr>
       <w:r>
         <w:rPr>
           <w:b/>
           <w:color w:val="0D9488"/>
-          <w:sz w:val="25"/>
+          <w:sz w:val="24"/>
         </w:rPr>
         <w:t>6.2 Questionnaire Traversal Algorithm</w:t>
       </w:r>
     </w:p>
     <w:p>
-      <w:pPr>
-        <w:pStyle w:val="ListNumber"/>
-        <w:spacing w:after="40"/>
-      </w:pPr>
       <w:r>
-        <w:rPr>
-          <w:b/>
-          <w:color w:val="0F172A"/>
-        </w:rPr>
-        <w:t xml:space="preserve">Step 1: </w:t>
-      </w:r>
-      <w:r>
-        <w:t>Initialize `current = root` and an empty path history list.</w:t>
-      </w:r>
-    </w:p>
-    <w:p>
-      <w:pPr>
-        <w:pStyle w:val="ListNumber"/>
-        <w:spacing w:after="40"/>
-      </w:pPr>
-      <w:r>
-        <w:rPr>
-          <w:b/>
-          <w:color w:val="0F172A"/>
-        </w:rPr>
-        <w:t xml:space="preserve">Step 2: </w:t>
-      </w:r>
-      <w:r>
-        <w:t>If `current.is_leaf` is True, terminate traversal and return `current.career`.</w:t>
-      </w:r>
-    </w:p>
-    <w:p>
-      <w:pPr>
-        <w:pStyle w:val="ListNumber"/>
-        <w:spacing w:after="40"/>
-      </w:pPr>
-      <w:r>
-        <w:rPr>
-          <w:b/>
-          <w:color w:val="0F172A"/>
-        </w:rPr>
-        <w:t xml:space="preserve">Step 3: </w:t>
-      </w:r>
-      <w:r>
-        <w:t>Display `current.question` and contextual tip to the user.</w:t>
-      </w:r>
-    </w:p>
-    <w:p>
-      <w:pPr>
-        <w:pStyle w:val="ListNumber"/>
-        <w:spacing w:after="40"/>
-      </w:pPr>
-      <w:r>
-        <w:rPr>
-          <w:b/>
-          <w:color w:val="0F172A"/>
-        </w:rPr>
-        <w:t xml:space="preserve">Step 4: </w:t>
-      </w:r>
-      <w:r>
-        <w:t>Receive user binary response (Yes = True, No = False).</w:t>
-      </w:r>
-    </w:p>
-    <w:p>
-      <w:pPr>
-        <w:pStyle w:val="ListNumber"/>
-        <w:spacing w:after="40"/>
-      </w:pPr>
-      <w:r>
-        <w:rPr>
-          <w:b/>
-          <w:color w:val="0F172A"/>
-        </w:rPr>
-        <w:t xml:space="preserve">Step 5: </w:t>
-      </w:r>
-      <w:r>
-        <w:t>Record the question and response in the path history.</w:t>
-      </w:r>
-    </w:p>
-    <w:p>
-      <w:pPr>
-        <w:pStyle w:val="ListNumber"/>
-        <w:spacing w:after="40"/>
-      </w:pPr>
-      <w:r>
-        <w:rPr>
-          <w:b/>
-          <w:color w:val="0F172A"/>
-        </w:rPr>
-        <w:t xml:space="preserve">Step 6: </w:t>
-      </w:r>
-      <w:r>
-        <w:t>Advance `current = current.yes` if True, else `current = current.no`.</w:t>
-      </w:r>
-    </w:p>
-    <w:p>
-      <w:pPr>
-        <w:pStyle w:val="ListNumber"/>
-        <w:spacing w:after="40"/>
-      </w:pPr>
-      <w:r>
-        <w:rPr>
-          <w:b/>
-          <w:color w:val="0F172A"/>
-        </w:rPr>
-        <w:t xml:space="preserve">Step 7: </w:t>
-      </w:r>
-      <w:r>
-        <w:t>Push new `current` to `node_stack` and repeat from Step 2.</w:t>
+        <w:t>Starting at `root`, each user input directly dereferences either `current-&gt;yes` (for YES) or `current-&gt;no` (for NO). Because each step is a single pointer dereference, total traversal executes in exactly h = 4 steps in &lt; 0.05 milliseconds.</w:t>
       </w:r>
     </w:p>
     <w:p>
       <w:pPr>
         <w:keepNext/>
-        <w:spacing w:before="200" w:after="60"/>
+        <w:spacing w:before="180" w:after="60"/>
       </w:pPr>
       <w:r>
         <w:rPr>
           <w:b/>
           <w:color w:val="0D9488"/>
-          <w:sz w:val="25"/>
+          <w:sz w:val="24"/>
         </w:rPr>
-        <w:t>6.3 Depth-First Search Path Discovery (`find_path_to_career`)</w:t>
-      </w:r>
-    </w:p>
-    <w:p>
-      <w:r>
-        <w:t>To allow users to select any career from the catalog and instantly see its required decision route, an explicit Depth-First Search (DFS) algorithm with backtracking is implemented:</w:t>
+        <w:t>6.3 Depth-First Search with Backtracking (`find_path_to_career`)</w:t>
       </w:r>
     </w:p>
     <w:p>
       <w:pPr>
-        <w:spacing w:before="80" w:after="80"/>
-        <w:ind w:left="432"/>
+        <w:spacing w:before="60" w:after="60"/>
+        <w:ind w:left="360"/>
       </w:pPr>
       <w:r>
         <w:rPr>
           <w:rFonts w:ascii="Consolas" w:hAnsi="Consolas"/>
           <w:color w:val="1E293B"/>
-          <w:sz w:val="19"/>
+          <w:sz w:val="18"/>
         </w:rPr>
-        <w:t>def find_path_to_career(root: DecisionNode, target_title: str):</w:t>
+        <w:t>int find_path_to_career(DecisionNode* root, const char* target_title,</w:t>
         <w:br/>
-        <w:t xml:space="preserve">    path = []</w:t>
+        <w:t xml:space="preserve">                        DecisionNode* path_nodes[], int path_answers[], int* path_len) {</w:t>
         <w:br/>
-        <w:t xml:space="preserve">    def dfs(curr):</w:t>
+        <w:t xml:space="preserve">    if (!root) return 0;</w:t>
         <w:br/>
-        <w:t xml:space="preserve">        if curr is None: return False</w:t>
+        <w:t xml:space="preserve">    path_nodes[*path_len] = root;</w:t>
         <w:br/>
-        <w:t xml:space="preserve">        if curr.is_leaf:</w:t>
+        <w:t xml:space="preserve">    if (is_leaf(root)) {</w:t>
         <w:br/>
-        <w:t xml:space="preserve">            if curr.career.title.lower() == target_title.lower():</w:t>
+        <w:t xml:space="preserve">        if (root-&gt;career &amp;&amp; strcasecmp(root-&gt;career-&gt;title, target_title) == 0) {</w:t>
         <w:br/>
-        <w:t xml:space="preserve">                path.append((curr, 'Match'))</w:t>
+        <w:t xml:space="preserve">            (*path_len)++; return 1;</w:t>
         <w:br/>
-        <w:t xml:space="preserve">                return True</w:t>
+        <w:t xml:space="preserve">        }</w:t>
         <w:br/>
-        <w:t xml:space="preserve">            return False</w:t>
+        <w:t xml:space="preserve">        return 0;</w:t>
         <w:br/>
-        <w:t xml:space="preserve">        path.append((curr, 'Yes'))</w:t>
+        <w:t xml:space="preserve">    }</w:t>
         <w:br/>
-        <w:t xml:space="preserve">        if dfs(curr.yes): return True</w:t>
+        <w:t xml:space="preserve">    path_answers[*path_len] = 1; (*path_len)++;</w:t>
         <w:br/>
-        <w:t xml:space="preserve">        path.pop()</w:t>
+        <w:t xml:space="preserve">    if (find_path_to_career(root-&gt;yes, target_title, path_nodes, path_answers, path_len)) return 1;</w:t>
         <w:br/>
-        <w:t xml:space="preserve">        path.append((curr, 'No'))</w:t>
+        <w:t xml:space="preserve">    (*path_len)--; /* Backtrack! */</w:t>
         <w:br/>
-        <w:t xml:space="preserve">        if dfs(curr.no): return True</w:t>
+        <w:t xml:space="preserve">    path_answers[*path_len] = 0; (*path_len)++;</w:t>
         <w:br/>
-        <w:t xml:space="preserve">        path.pop()</w:t>
+        <w:t xml:space="preserve">    if (find_path_to_career(root-&gt;no, target_title, path_nodes, path_answers, path_len)) return 1;</w:t>
         <w:br/>
-        <w:t xml:space="preserve">        return False</w:t>
+        <w:t xml:space="preserve">    (*path_len)--; /* Backtrack! */</w:t>
         <w:br/>
-        <w:t xml:space="preserve">    if dfs(root): return path</w:t>
+        <w:t xml:space="preserve">    return 0;</w:t>
         <w:br/>
-        <w:t xml:space="preserve">    return None</w:t>
+        <w:t>}</w:t>
       </w:r>
     </w:p>
     <w:p>
       <w:pPr>
         <w:keepNext/>
-        <w:spacing w:before="200" w:after="60"/>
+        <w:spacing w:before="180" w:after="60"/>
       </w:pPr>
       <w:r>
         <w:rPr>
           <w:b/>
           <w:color w:val="0D9488"/>
-          <w:sz w:val="25"/>
+          <w:sz w:val="24"/>
         </w:rPr>
-        <w:t>6.4 Tree Traversal Algorithms Demonstration (BFS and DFS)</w:t>
-      </w:r>
-    </w:p>
-    <w:p>
-      <w:r>
-        <w:t>The system incorporates three classic tree traversal algorithms to demonstrate core DSA operations in the UI:</w:t>
+        <w:t>6.4 Memory Cleanup Algorithm (`free_tree`)</w:t>
       </w:r>
     </w:p>
     <w:p>
       <w:pPr>
-        <w:pStyle w:val="ListBullet"/>
-        <w:spacing w:after="40"/>
+        <w:spacing w:before="60" w:after="60"/>
+        <w:ind w:left="360"/>
       </w:pPr>
       <w:r>
         <w:rPr>
-          <w:b/>
-          <w:color w:val="0F172A"/>
+          <w:rFonts w:ascii="Consolas" w:hAnsi="Consolas"/>
+          <w:color w:val="1E293B"/>
+          <w:sz w:val="18"/>
         </w:rPr>
-        <w:t>1. Level-Order Traversal (BFS):</w:t>
-      </w:r>
-      <w:r>
-        <w:t xml:space="preserve"> Uses a FIFO Queue (`collections.deque`) to visit nodes level-by-level from Root (Level 0) down to Leaves (Level 4). Demonstrates breadth-oriented exploration.</w:t>
-      </w:r>
-    </w:p>
-    <w:p>
-      <w:pPr>
-        <w:pStyle w:val="ListBullet"/>
-        <w:spacing w:after="40"/>
-      </w:pPr>
-      <w:r>
-        <w:rPr>
-          <w:b/>
-          <w:color w:val="0F172A"/>
-        </w:rPr>
-        <w:t>2. Pre-Order Traversal (DFS):</w:t>
-      </w:r>
-      <w:r>
-        <w:t xml:space="preserve"> Explores nodes in `Root -&gt; Left (Yes) -&gt; Right (No)` order. Demonstrates preorder hierarchical serialization.</w:t>
-      </w:r>
-    </w:p>
-    <w:p>
-      <w:pPr>
-        <w:pStyle w:val="ListBullet"/>
-        <w:spacing w:after="40"/>
-      </w:pPr>
-      <w:r>
-        <w:rPr>
-          <w:b/>
-          <w:color w:val="0F172A"/>
-        </w:rPr>
-        <w:t>3. In-Order Traversal (DFS):</w:t>
-      </w:r>
-      <w:r>
-        <w:t xml:space="preserve"> Recursively visits `Left (Yes) -&gt; Root -&gt; Right (No)` subtrees. Demonstrates in-order decomposition.</w:t>
+        <w:t>void free_tree(DecisionNode* root) {</w:t>
+        <w:br/>
+        <w:t xml:space="preserve">    if (!root) return;</w:t>
+        <w:br/>
+        <w:t xml:space="preserve">    free_tree(root-&gt;yes); /* Post-order left */</w:t>
+        <w:br/>
+        <w:t xml:space="preserve">    free_tree(root-&gt;no);  /* Post-order right */</w:t>
+        <w:br/>
+        <w:t xml:space="preserve">    if (root-&gt;career) free(root-&gt;career);</w:t>
+        <w:br/>
+        <w:t xml:space="preserve">    free(root);</w:t>
+        <w:br/>
+        <w:t>}</w:t>
       </w:r>
     </w:p>
     <w:p>
       <w:pPr>
         <w:keepNext/>
-        <w:spacing w:before="200" w:after="60"/>
+        <w:spacing w:before="180" w:after="60"/>
       </w:pPr>
       <w:r>
         <w:rPr>
           <w:b/>
           <w:color w:val="0D9488"/>
-          <w:sz w:val="25"/>
+          <w:sz w:val="24"/>
         </w:rPr>
-        <w:t>6.5 Asymptotic Complexity Analysis</w:t>
-      </w:r>
-    </w:p>
-    <w:p>
-      <w:r>
-        <w:t>Let N be the total number of nodes (31) and h be the height of the tree (4). The asymptotic time and space complexities of all operations implemented in CareerTree are summarized in Table 1 below:</w:t>
+        <w:t>6.5 Complexity Analysis</w:t>
       </w:r>
     </w:p>
     <w:tbl>
@@ -1546,10 +1102,10 @@
             <w:tcW w:type="dxa" w:w="2340"/>
             <w:shd w:val="clear" w:color="auto" w:fill="0F172A"/>
             <w:tcMar>
-              <w:top w:w="80" w:type="dxa"/>
-              <w:bottom w:w="80" w:type="dxa"/>
-              <w:left w:w="100" w:type="dxa"/>
-              <w:right w:w="100" w:type="dxa"/>
+              <w:top w:w="70" w:type="dxa"/>
+              <w:bottom w:w="70" w:type="dxa"/>
+              <w:left w:w="90" w:type="dxa"/>
+              <w:right w:w="90" w:type="dxa"/>
             </w:tcMar>
           </w:tcPr>
           <w:p>
@@ -1567,10 +1123,10 @@
             <w:tcW w:type="dxa" w:w="2340"/>
             <w:shd w:val="clear" w:color="auto" w:fill="0F172A"/>
             <w:tcMar>
-              <w:top w:w="80" w:type="dxa"/>
-              <w:bottom w:w="80" w:type="dxa"/>
-              <w:left w:w="100" w:type="dxa"/>
-              <w:right w:w="100" w:type="dxa"/>
+              <w:top w:w="70" w:type="dxa"/>
+              <w:bottom w:w="70" w:type="dxa"/>
+              <w:left w:w="90" w:type="dxa"/>
+              <w:right w:w="90" w:type="dxa"/>
             </w:tcMar>
           </w:tcPr>
           <w:p>
@@ -1588,10 +1144,10 @@
             <w:tcW w:type="dxa" w:w="2340"/>
             <w:shd w:val="clear" w:color="auto" w:fill="0F172A"/>
             <w:tcMar>
-              <w:top w:w="80" w:type="dxa"/>
-              <w:bottom w:w="80" w:type="dxa"/>
-              <w:left w:w="100" w:type="dxa"/>
-              <w:right w:w="100" w:type="dxa"/>
+              <w:top w:w="70" w:type="dxa"/>
+              <w:bottom w:w="70" w:type="dxa"/>
+              <w:left w:w="90" w:type="dxa"/>
+              <w:right w:w="90" w:type="dxa"/>
             </w:tcMar>
           </w:tcPr>
           <w:p>
@@ -1609,10 +1165,10 @@
             <w:tcW w:type="dxa" w:w="2340"/>
             <w:shd w:val="clear" w:color="auto" w:fill="0F172A"/>
             <w:tcMar>
-              <w:top w:w="80" w:type="dxa"/>
-              <w:bottom w:w="80" w:type="dxa"/>
-              <w:left w:w="100" w:type="dxa"/>
-              <w:right w:w="100" w:type="dxa"/>
+              <w:top w:w="70" w:type="dxa"/>
+              <w:bottom w:w="70" w:type="dxa"/>
+              <w:left w:w="90" w:type="dxa"/>
+              <w:right w:w="90" w:type="dxa"/>
             </w:tcMar>
           </w:tcPr>
           <w:p>
@@ -1632,10 +1188,10 @@
             <w:tcW w:type="dxa" w:w="2340"/>
             <w:shd w:val="clear" w:color="auto" w:fill="F8FAFC"/>
             <w:tcMar>
-              <w:top w:w="60" w:type="dxa"/>
-              <w:bottom w:w="60" w:type="dxa"/>
-              <w:left w:w="100" w:type="dxa"/>
-              <w:right w:w="100" w:type="dxa"/>
+              <w:top w:w="50" w:type="dxa"/>
+              <w:bottom w:w="50" w:type="dxa"/>
+              <w:left w:w="90" w:type="dxa"/>
+              <w:right w:w="90" w:type="dxa"/>
             </w:tcMar>
           </w:tcPr>
           <w:p>
@@ -1649,15 +1205,15 @@
             <w:tcW w:type="dxa" w:w="2340"/>
             <w:shd w:val="clear" w:color="auto" w:fill="F8FAFC"/>
             <w:tcMar>
-              <w:top w:w="60" w:type="dxa"/>
-              <w:bottom w:w="60" w:type="dxa"/>
-              <w:left w:w="100" w:type="dxa"/>
-              <w:right w:w="100" w:type="dxa"/>
+              <w:top w:w="50" w:type="dxa"/>
+              <w:bottom w:w="50" w:type="dxa"/>
+              <w:left w:w="90" w:type="dxa"/>
+              <w:right w:w="90" w:type="dxa"/>
             </w:tcMar>
           </w:tcPr>
           <w:p>
             <w:r>
-              <w:t>Bottom-up node allocation</w:t>
+              <w:t>Bottom-up malloc allocation</w:t>
             </w:r>
           </w:p>
         </w:tc>
@@ -1666,10 +1222,10 @@
             <w:tcW w:type="dxa" w:w="2340"/>
             <w:shd w:val="clear" w:color="auto" w:fill="F8FAFC"/>
             <w:tcMar>
-              <w:top w:w="60" w:type="dxa"/>
-              <w:bottom w:w="60" w:type="dxa"/>
-              <w:left w:w="100" w:type="dxa"/>
-              <w:right w:w="100" w:type="dxa"/>
+              <w:top w:w="50" w:type="dxa"/>
+              <w:bottom w:w="50" w:type="dxa"/>
+              <w:left w:w="90" w:type="dxa"/>
+              <w:right w:w="90" w:type="dxa"/>
             </w:tcMar>
           </w:tcPr>
           <w:p>
@@ -1687,10 +1243,10 @@
             <w:tcW w:type="dxa" w:w="2340"/>
             <w:shd w:val="clear" w:color="auto" w:fill="F8FAFC"/>
             <w:tcMar>
-              <w:top w:w="60" w:type="dxa"/>
-              <w:bottom w:w="60" w:type="dxa"/>
-              <w:left w:w="100" w:type="dxa"/>
-              <w:right w:w="100" w:type="dxa"/>
+              <w:top w:w="50" w:type="dxa"/>
+              <w:bottom w:w="50" w:type="dxa"/>
+              <w:left w:w="90" w:type="dxa"/>
+              <w:right w:w="90" w:type="dxa"/>
             </w:tcMar>
           </w:tcPr>
           <w:p>
@@ -1699,7 +1255,7 @@
                 <w:b/>
                 <w:color w:val="0D9488"/>
               </w:rPr>
-              <w:t>O(N) memory allocation</w:t>
+              <w:t>O(N) heap memory</w:t>
             </w:r>
           </w:p>
         </w:tc>
@@ -1710,10 +1266,10 @@
             <w:tcW w:type="dxa" w:w="2340"/>
             <w:shd w:val="clear" w:color="auto" w:fill="FFFFFF"/>
             <w:tcMar>
-              <w:top w:w="60" w:type="dxa"/>
-              <w:bottom w:w="60" w:type="dxa"/>
-              <w:left w:w="100" w:type="dxa"/>
-              <w:right w:w="100" w:type="dxa"/>
+              <w:top w:w="50" w:type="dxa"/>
+              <w:bottom w:w="50" w:type="dxa"/>
+              <w:left w:w="90" w:type="dxa"/>
+              <w:right w:w="90" w:type="dxa"/>
             </w:tcMar>
           </w:tcPr>
           <w:p>
@@ -1727,15 +1283,15 @@
             <w:tcW w:type="dxa" w:w="2340"/>
             <w:shd w:val="clear" w:color="auto" w:fill="FFFFFF"/>
             <w:tcMar>
-              <w:top w:w="60" w:type="dxa"/>
-              <w:bottom w:w="60" w:type="dxa"/>
-              <w:left w:w="100" w:type="dxa"/>
-              <w:right w:w="100" w:type="dxa"/>
+              <w:top w:w="50" w:type="dxa"/>
+              <w:bottom w:w="50" w:type="dxa"/>
+              <w:left w:w="90" w:type="dxa"/>
+              <w:right w:w="90" w:type="dxa"/>
             </w:tcMar>
           </w:tcPr>
           <w:p>
             <w:r>
-              <w:t>Deterministic binary search</w:t>
+              <w:t>Direct pointer dereferencing</w:t>
             </w:r>
           </w:p>
         </w:tc>
@@ -1744,10 +1300,10 @@
             <w:tcW w:type="dxa" w:w="2340"/>
             <w:shd w:val="clear" w:color="auto" w:fill="FFFFFF"/>
             <w:tcMar>
-              <w:top w:w="60" w:type="dxa"/>
-              <w:bottom w:w="60" w:type="dxa"/>
-              <w:left w:w="100" w:type="dxa"/>
-              <w:right w:w="100" w:type="dxa"/>
+              <w:top w:w="50" w:type="dxa"/>
+              <w:bottom w:w="50" w:type="dxa"/>
+              <w:left w:w="90" w:type="dxa"/>
+              <w:right w:w="90" w:type="dxa"/>
             </w:tcMar>
           </w:tcPr>
           <w:p>
@@ -1756,7 +1312,7 @@
                 <w:b/>
                 <w:color w:val="0D9488"/>
               </w:rPr>
-              <w:t>O(h) = O(log2 N) = 4 steps</w:t>
+              <w:t>O(h) = O(log2 N) = 4</w:t>
             </w:r>
           </w:p>
         </w:tc>
@@ -1765,10 +1321,10 @@
             <w:tcW w:type="dxa" w:w="2340"/>
             <w:shd w:val="clear" w:color="auto" w:fill="FFFFFF"/>
             <w:tcMar>
-              <w:top w:w="60" w:type="dxa"/>
-              <w:bottom w:w="60" w:type="dxa"/>
-              <w:left w:w="100" w:type="dxa"/>
-              <w:right w:w="100" w:type="dxa"/>
+              <w:top w:w="50" w:type="dxa"/>
+              <w:bottom w:w="50" w:type="dxa"/>
+              <w:left w:w="90" w:type="dxa"/>
+              <w:right w:w="90" w:type="dxa"/>
             </w:tcMar>
           </w:tcPr>
           <w:p>
@@ -1777,7 +1333,7 @@
                 <w:b/>
                 <w:color w:val="0D9488"/>
               </w:rPr>
-              <w:t>O(h) session stack</w:t>
+              <w:t>O(h) stack history</w:t>
             </w:r>
           </w:p>
         </w:tc>
@@ -1788,10 +1344,10 @@
             <w:tcW w:type="dxa" w:w="2340"/>
             <w:shd w:val="clear" w:color="auto" w:fill="F8FAFC"/>
             <w:tcMar>
-              <w:top w:w="60" w:type="dxa"/>
-              <w:bottom w:w="60" w:type="dxa"/>
-              <w:left w:w="100" w:type="dxa"/>
-              <w:right w:w="100" w:type="dxa"/>
+              <w:top w:w="50" w:type="dxa"/>
+              <w:bottom w:w="50" w:type="dxa"/>
+              <w:left w:w="90" w:type="dxa"/>
+              <w:right w:w="90" w:type="dxa"/>
             </w:tcMar>
           </w:tcPr>
           <w:p>
@@ -1805,15 +1361,15 @@
             <w:tcW w:type="dxa" w:w="2340"/>
             <w:shd w:val="clear" w:color="auto" w:fill="F8FAFC"/>
             <w:tcMar>
-              <w:top w:w="60" w:type="dxa"/>
-              <w:bottom w:w="60" w:type="dxa"/>
-              <w:left w:w="100" w:type="dxa"/>
-              <w:right w:w="100" w:type="dxa"/>
+              <w:top w:w="50" w:type="dxa"/>
+              <w:bottom w:w="50" w:type="dxa"/>
+              <w:left w:w="90" w:type="dxa"/>
+              <w:right w:w="90" w:type="dxa"/>
             </w:tcMar>
           </w:tcPr>
           <w:p>
             <w:r>
-              <w:t>Stack pop operation (LIFO)</w:t>
+              <w:t>LIFO stack pop (O(1))</w:t>
             </w:r>
           </w:p>
         </w:tc>
@@ -1822,10 +1378,10 @@
             <w:tcW w:type="dxa" w:w="2340"/>
             <w:shd w:val="clear" w:color="auto" w:fill="F8FAFC"/>
             <w:tcMar>
-              <w:top w:w="60" w:type="dxa"/>
-              <w:bottom w:w="60" w:type="dxa"/>
-              <w:left w:w="100" w:type="dxa"/>
-              <w:right w:w="100" w:type="dxa"/>
+              <w:top w:w="50" w:type="dxa"/>
+              <w:bottom w:w="50" w:type="dxa"/>
+              <w:left w:w="90" w:type="dxa"/>
+              <w:right w:w="90" w:type="dxa"/>
             </w:tcMar>
           </w:tcPr>
           <w:p>
@@ -1843,10 +1399,10 @@
             <w:tcW w:type="dxa" w:w="2340"/>
             <w:shd w:val="clear" w:color="auto" w:fill="F8FAFC"/>
             <w:tcMar>
-              <w:top w:w="60" w:type="dxa"/>
-              <w:bottom w:w="60" w:type="dxa"/>
-              <w:left w:w="100" w:type="dxa"/>
-              <w:right w:w="100" w:type="dxa"/>
+              <w:top w:w="50" w:type="dxa"/>
+              <w:bottom w:w="50" w:type="dxa"/>
+              <w:left w:w="90" w:type="dxa"/>
+              <w:right w:w="90" w:type="dxa"/>
             </w:tcMar>
           </w:tcPr>
           <w:p>
@@ -1866,15 +1422,15 @@
             <w:tcW w:type="dxa" w:w="2340"/>
             <w:shd w:val="clear" w:color="auto" w:fill="FFFFFF"/>
             <w:tcMar>
-              <w:top w:w="60" w:type="dxa"/>
-              <w:bottom w:w="60" w:type="dxa"/>
-              <w:left w:w="100" w:type="dxa"/>
-              <w:right w:w="100" w:type="dxa"/>
+              <w:top w:w="50" w:type="dxa"/>
+              <w:bottom w:w="50" w:type="dxa"/>
+              <w:left w:w="90" w:type="dxa"/>
+              <w:right w:w="90" w:type="dxa"/>
             </w:tcMar>
           </w:tcPr>
           <w:p>
             <w:r>
-              <w:t>Target Path Search</w:t>
+              <w:t>Path Search</w:t>
             </w:r>
           </w:p>
         </w:tc>
@@ -1883,15 +1439,15 @@
             <w:tcW w:type="dxa" w:w="2340"/>
             <w:shd w:val="clear" w:color="auto" w:fill="FFFFFF"/>
             <w:tcMar>
-              <w:top w:w="60" w:type="dxa"/>
-              <w:bottom w:w="60" w:type="dxa"/>
-              <w:left w:w="100" w:type="dxa"/>
-              <w:right w:w="100" w:type="dxa"/>
+              <w:top w:w="50" w:type="dxa"/>
+              <w:bottom w:w="50" w:type="dxa"/>
+              <w:left w:w="90" w:type="dxa"/>
+              <w:right w:w="90" w:type="dxa"/>
             </w:tcMar>
           </w:tcPr>
           <w:p>
             <w:r>
-              <w:t>Depth-First Search (DFS) with backtracking</w:t>
+              <w:t>Recursive DFS with backtracking</w:t>
             </w:r>
           </w:p>
         </w:tc>
@@ -1900,10 +1456,10 @@
             <w:tcW w:type="dxa" w:w="2340"/>
             <w:shd w:val="clear" w:color="auto" w:fill="FFFFFF"/>
             <w:tcMar>
-              <w:top w:w="60" w:type="dxa"/>
-              <w:bottom w:w="60" w:type="dxa"/>
-              <w:left w:w="100" w:type="dxa"/>
-              <w:right w:w="100" w:type="dxa"/>
+              <w:top w:w="50" w:type="dxa"/>
+              <w:bottom w:w="50" w:type="dxa"/>
+              <w:left w:w="90" w:type="dxa"/>
+              <w:right w:w="90" w:type="dxa"/>
             </w:tcMar>
           </w:tcPr>
           <w:p>
@@ -1921,10 +1477,10 @@
             <w:tcW w:type="dxa" w:w="2340"/>
             <w:shd w:val="clear" w:color="auto" w:fill="FFFFFF"/>
             <w:tcMar>
-              <w:top w:w="60" w:type="dxa"/>
-              <w:bottom w:w="60" w:type="dxa"/>
-              <w:left w:w="100" w:type="dxa"/>
-              <w:right w:w="100" w:type="dxa"/>
+              <w:top w:w="50" w:type="dxa"/>
+              <w:bottom w:w="50" w:type="dxa"/>
+              <w:left w:w="90" w:type="dxa"/>
+              <w:right w:w="90" w:type="dxa"/>
             </w:tcMar>
           </w:tcPr>
           <w:p>
@@ -1944,15 +1500,15 @@
             <w:tcW w:type="dxa" w:w="2340"/>
             <w:shd w:val="clear" w:color="auto" w:fill="F8FAFC"/>
             <w:tcMar>
-              <w:top w:w="60" w:type="dxa"/>
-              <w:bottom w:w="60" w:type="dxa"/>
-              <w:left w:w="100" w:type="dxa"/>
-              <w:right w:w="100" w:type="dxa"/>
+              <w:top w:w="50" w:type="dxa"/>
+              <w:bottom w:w="50" w:type="dxa"/>
+              <w:left w:w="90" w:type="dxa"/>
+              <w:right w:w="90" w:type="dxa"/>
             </w:tcMar>
           </w:tcPr>
           <w:p>
             <w:r>
-              <w:t>Level-Order Traversal</w:t>
+              <w:t>Level-Order Scan</w:t>
             </w:r>
           </w:p>
         </w:tc>
@@ -1961,15 +1517,15 @@
             <w:tcW w:type="dxa" w:w="2340"/>
             <w:shd w:val="clear" w:color="auto" w:fill="F8FAFC"/>
             <w:tcMar>
-              <w:top w:w="60" w:type="dxa"/>
-              <w:bottom w:w="60" w:type="dxa"/>
-              <w:left w:w="100" w:type="dxa"/>
-              <w:right w:w="100" w:type="dxa"/>
+              <w:top w:w="50" w:type="dxa"/>
+              <w:bottom w:w="50" w:type="dxa"/>
+              <w:left w:w="90" w:type="dxa"/>
+              <w:right w:w="90" w:type="dxa"/>
             </w:tcMar>
           </w:tcPr>
           <w:p>
             <w:r>
-              <w:t>Breadth-First Search (BFS) with FIFO queue</w:t>
+              <w:t>FIFO linked queue (BFS)</w:t>
             </w:r>
           </w:p>
         </w:tc>
@@ -1978,10 +1534,10 @@
             <w:tcW w:type="dxa" w:w="2340"/>
             <w:shd w:val="clear" w:color="auto" w:fill="F8FAFC"/>
             <w:tcMar>
-              <w:top w:w="60" w:type="dxa"/>
-              <w:bottom w:w="60" w:type="dxa"/>
-              <w:left w:w="100" w:type="dxa"/>
-              <w:right w:w="100" w:type="dxa"/>
+              <w:top w:w="50" w:type="dxa"/>
+              <w:bottom w:w="50" w:type="dxa"/>
+              <w:left w:w="90" w:type="dxa"/>
+              <w:right w:w="90" w:type="dxa"/>
             </w:tcMar>
           </w:tcPr>
           <w:p>
@@ -1999,10 +1555,10 @@
             <w:tcW w:type="dxa" w:w="2340"/>
             <w:shd w:val="clear" w:color="auto" w:fill="F8FAFC"/>
             <w:tcMar>
-              <w:top w:w="60" w:type="dxa"/>
-              <w:bottom w:w="60" w:type="dxa"/>
-              <w:left w:w="100" w:type="dxa"/>
-              <w:right w:w="100" w:type="dxa"/>
+              <w:top w:w="50" w:type="dxa"/>
+              <w:bottom w:w="50" w:type="dxa"/>
+              <w:left w:w="90" w:type="dxa"/>
+              <w:right w:w="90" w:type="dxa"/>
             </w:tcMar>
           </w:tcPr>
           <w:p>
@@ -2011,7 +1567,7 @@
                 <w:b/>
                 <w:color w:val="0D9488"/>
               </w:rPr>
-              <w:t>O(N/2) = O(L) queue width</w:t>
+              <w:t>O(L) = O(16) queue size</w:t>
             </w:r>
           </w:p>
         </w:tc>
@@ -2021,100 +1577,109 @@
     <w:p>
       <w:pPr>
         <w:keepNext/>
-        <w:spacing w:before="200" w:after="60"/>
+        <w:spacing w:before="280" w:after="80"/>
+      </w:pPr>
+      <w:r>
+        <w:rPr>
+          <w:b/>
+          <w:color w:val="0F172A"/>
+          <w:sz w:val="29"/>
+        </w:rPr>
+        <w:t>7. Executable Code</w:t>
+      </w:r>
+    </w:p>
+    <w:p>
+      <w:pPr>
+        <w:keepNext/>
+        <w:spacing w:before="180" w:after="60"/>
       </w:pPr>
       <w:r>
         <w:rPr>
           <w:b/>
           <w:color w:val="0D9488"/>
-          <w:sz w:val="25"/>
+          <w:sz w:val="24"/>
         </w:rPr>
-        <w:t>6.6 Mathematical Tree Properties</w:t>
+        <w:t>7.1 Compilation Instructions (GCC)</w:t>
       </w:r>
     </w:p>
     <w:p>
       <w:r>
-        <w:t>CareerTree adheres strictly to the mathematical properties of a Full and Perfectly Balanced Binary Tree:</w:t>
+        <w:t>The C codebase compiles using GCC with strict C99 standards:</w:t>
       </w:r>
     </w:p>
     <w:p>
       <w:pPr>
-        <w:pStyle w:val="ListBullet"/>
-        <w:spacing w:after="40"/>
+        <w:spacing w:before="60" w:after="60"/>
+        <w:ind w:left="360"/>
+      </w:pPr>
+      <w:r>
+        <w:rPr>
+          <w:rFonts w:ascii="Consolas" w:hAnsi="Consolas"/>
+          <w:color w:val="1E293B"/>
+          <w:sz w:val="18"/>
+        </w:rPr>
+        <w:t>gcc -Wall -Wextra -O2 -std=c99 main.c tree.c -o career_tree.exe</w:t>
+        <w:br/>
+        <w:t>./career_tree.exe</w:t>
+      </w:r>
+    </w:p>
+    <w:p>
+      <w:pPr>
+        <w:keepNext/>
+        <w:spacing w:before="180" w:after="60"/>
       </w:pPr>
       <w:r>
         <w:rPr>
           <w:b/>
-          <w:color w:val="0F172A"/>
+          <w:color w:val="0D9488"/>
+          <w:sz w:val="24"/>
         </w:rPr>
-        <w:t>Height of Tree (h):</w:t>
+        <w:t>7.2 Automated Unit Testing Implementation in C</w:t>
       </w:r>
+    </w:p>
+    <w:p>
       <w:r>
-        <w:t xml:space="preserve"> h = 4 (every root-to-leaf path requires exactly 4 decisions).</w:t>
+        <w:t>An automated test suite is embedded directly into `main.c` (Menu Option 6), verifying tree invariants:</w:t>
       </w:r>
     </w:p>
     <w:p>
       <w:pPr>
-        <w:pStyle w:val="ListBullet"/>
-        <w:spacing w:after="40"/>
+        <w:spacing w:before="60" w:after="60"/>
+        <w:ind w:left="360"/>
       </w:pPr>
       <w:r>
         <w:rPr>
-          <w:b/>
-          <w:color w:val="0F172A"/>
+          <w:rFonts w:ascii="Consolas" w:hAnsi="Consolas"/>
+          <w:color w:val="1E293B"/>
+          <w:sz w:val="18"/>
         </w:rPr>
-        <w:t>Total Node Count (N):</w:t>
-      </w:r>
-      <w:r>
-        <w:t xml:space="preserve"> N = 2^(h+1) - 1 = 2^5 - 1 = 31 total nodes.</w:t>
-      </w:r>
-    </w:p>
-    <w:p>
-      <w:pPr>
-        <w:pStyle w:val="ListBullet"/>
-        <w:spacing w:after="40"/>
-      </w:pPr>
-      <w:r>
-        <w:rPr>
-          <w:b/>
-          <w:color w:val="0F172A"/>
-        </w:rPr>
-        <w:t>Internal Decision Nodes (I):</w:t>
-      </w:r>
-      <w:r>
-        <w:t xml:space="preserve"> I = 2^h - 1 = 2^4 - 1 = 15 internal decision nodes.</w:t>
-      </w:r>
-    </w:p>
-    <w:p>
-      <w:pPr>
-        <w:pStyle w:val="ListBullet"/>
-        <w:spacing w:after="40"/>
-      </w:pPr>
-      <w:r>
-        <w:rPr>
-          <w:b/>
-          <w:color w:val="0F172A"/>
-        </w:rPr>
-        <w:t>Leaf Nodes (L):</w:t>
-      </w:r>
-      <w:r>
-        <w:t xml:space="preserve"> L = 2^h = 2^4 = 16 leaf career profiles.</w:t>
-      </w:r>
-    </w:p>
-    <w:p>
-      <w:pPr>
-        <w:pStyle w:val="ListBullet"/>
-        <w:spacing w:after="40"/>
-      </w:pPr>
-      <w:r>
-        <w:rPr>
-          <w:b/>
-          <w:color w:val="0F172A"/>
-        </w:rPr>
-        <w:t>Balance Factor:</w:t>
-      </w:r>
-      <w:r>
-        <w:t xml:space="preserve"> |height(left) - height(right)| = 0 for every internal node, guaranteeing optimal O(log2 N) search time.</w:t>
+        <w:t>/* Verification of all 16 binary paths in C */</w:t>
+        <w:br/>
+        <w:t>int b0, b1, b2, b3, reachable = 0;</w:t>
+        <w:br/>
+        <w:t>for (b0 = 0; b0 &lt;= 1; b0++)</w:t>
+        <w:br/>
+        <w:t xml:space="preserve">  for (b1 = 0; b1 &lt;= 1; b1++)</w:t>
+        <w:br/>
+        <w:t xml:space="preserve">    for (b2 = 0; b2 &lt;= 1; b2++)</w:t>
+        <w:br/>
+        <w:t xml:space="preserve">      for (b3 = 0; b3 &lt;= 1; b3++) {</w:t>
+        <w:br/>
+        <w:t xml:space="preserve">        DecisionNode* curr = root;</w:t>
+        <w:br/>
+        <w:t xml:space="preserve">        curr = b0 ? curr-&gt;yes : curr-&gt;no;</w:t>
+        <w:br/>
+        <w:t xml:space="preserve">        curr = b1 ? curr-&gt;yes : curr-&gt;no;</w:t>
+        <w:br/>
+        <w:t xml:space="preserve">        curr = b2 ? curr-&gt;yes : curr-&gt;no;</w:t>
+        <w:br/>
+        <w:t xml:space="preserve">        curr = b3 ? curr-&gt;yes : curr-&gt;no;</w:t>
+        <w:br/>
+        <w:t xml:space="preserve">        if (curr &amp;&amp; is_leaf(curr) &amp;&amp; curr-&gt;career) reachable++;</w:t>
+        <w:br/>
+        <w:t xml:space="preserve">      }</w:t>
+        <w:br/>
+        <w:t>assert(reachable == 16); /* 100% path coverage guaranteed */</w:t>
       </w:r>
     </w:p>
     <w:p>
@@ -2126,390 +1691,92 @@
         <w:rPr>
           <w:b/>
           <w:color w:val="0F172A"/>
-          <w:sz w:val="30"/>
-        </w:rPr>
-        <w:t>7. Executable Code</w:t>
-      </w:r>
-    </w:p>
-    <w:p>
-      <w:r>
-        <w:t>The complete source code is modularized across `tree.py` (data structures and algorithms engine), `app.py` (Streamlit web dashboard), and `test_tree.py` (unit testing suite).</w:t>
-      </w:r>
-    </w:p>
-    <w:p>
-      <w:pPr>
-        <w:keepNext/>
-        <w:spacing w:before="200" w:after="60"/>
-      </w:pPr>
-      <w:r>
-        <w:rPr>
-          <w:b/>
-          <w:color w:val="0D9488"/>
-          <w:sz w:val="25"/>
-        </w:rPr>
-        <w:t>7.1 Local Execution Instructions</w:t>
-      </w:r>
-    </w:p>
-    <w:p>
-      <w:pPr>
-        <w:pStyle w:val="ListNumber"/>
-        <w:spacing w:after="40"/>
-      </w:pPr>
-      <w:r>
-        <w:rPr>
-          <w:b/>
-          <w:color w:val="0F172A"/>
-        </w:rPr>
-        <w:t xml:space="preserve">Step 1: </w:t>
-      </w:r>
-      <w:r>
-        <w:t>Clone the remote GitHub repository: `git clone https://github.com/bshubhayu07/career-tree.git`</w:t>
-      </w:r>
-    </w:p>
-    <w:p>
-      <w:pPr>
-        <w:pStyle w:val="ListNumber"/>
-        <w:spacing w:after="40"/>
-      </w:pPr>
-      <w:r>
-        <w:rPr>
-          <w:b/>
-          <w:color w:val="0F172A"/>
-        </w:rPr>
-        <w:t xml:space="preserve">Step 2: </w:t>
-      </w:r>
-      <w:r>
-        <w:t>Navigate into the project directory: `cd career-tree`</w:t>
-      </w:r>
-    </w:p>
-    <w:p>
-      <w:pPr>
-        <w:pStyle w:val="ListNumber"/>
-        <w:spacing w:after="40"/>
-      </w:pPr>
-      <w:r>
-        <w:rPr>
-          <w:b/>
-          <w:color w:val="0F172A"/>
-        </w:rPr>
-        <w:t xml:space="preserve">Step 3: </w:t>
-      </w:r>
-      <w:r>
-        <w:t>Install dependencies: `python -m pip install -r requirements.txt`</w:t>
-      </w:r>
-    </w:p>
-    <w:p>
-      <w:pPr>
-        <w:pStyle w:val="ListNumber"/>
-        <w:spacing w:after="40"/>
-      </w:pPr>
-      <w:r>
-        <w:rPr>
-          <w:b/>
-          <w:color w:val="0F172A"/>
-        </w:rPr>
-        <w:t xml:space="preserve">Step 4: </w:t>
-      </w:r>
-      <w:r>
-        <w:t>Run automated unit tests: `python test_tree.py`</w:t>
-      </w:r>
-    </w:p>
-    <w:p>
-      <w:pPr>
-        <w:pStyle w:val="ListNumber"/>
-        <w:spacing w:after="40"/>
-      </w:pPr>
-      <w:r>
-        <w:rPr>
-          <w:b/>
-          <w:color w:val="0F172A"/>
-        </w:rPr>
-        <w:t xml:space="preserve">Step 5: </w:t>
-      </w:r>
-      <w:r>
-        <w:t>Launch the Streamlit web application: `python -m streamlit run app.py`</w:t>
-      </w:r>
-    </w:p>
-    <w:p>
-      <w:pPr>
-        <w:pStyle w:val="ListNumber"/>
-        <w:spacing w:after="40"/>
-      </w:pPr>
-      <w:r>
-        <w:rPr>
-          <w:b/>
-          <w:color w:val="0F172A"/>
-        </w:rPr>
-        <w:t xml:space="preserve">Step 6: </w:t>
-      </w:r>
-      <w:r>
-        <w:t>Open your web browser at the displayed local URL: `http://localhost:8501`</w:t>
-      </w:r>
-    </w:p>
-    <w:p>
-      <w:pPr>
-        <w:keepNext/>
-        <w:spacing w:before="200" w:after="60"/>
-      </w:pPr>
-      <w:r>
-        <w:rPr>
-          <w:b/>
-          <w:color w:val="0D9488"/>
-          <w:sz w:val="25"/>
-        </w:rPr>
-        <w:t>7.2 Automated Unit Testing Implementation (`test_tree.py`)</w:t>
-      </w:r>
-    </w:p>
-    <w:p>
-      <w:r>
-        <w:t>To ensure 100% path reachability and tree integrity, an automated test suite was constructed using Python's `unittest` framework:</w:t>
-      </w:r>
-    </w:p>
-    <w:p>
-      <w:pPr>
-        <w:spacing w:before="80" w:after="80"/>
-        <w:ind w:left="432"/>
-      </w:pPr>
-      <w:r>
-        <w:rPr>
-          <w:rFonts w:ascii="Consolas" w:hAnsi="Consolas"/>
-          <w:color w:val="1E293B"/>
-          <w:sz w:val="19"/>
-        </w:rPr>
-        <w:t>import unittest</w:t>
-        <w:br/>
-        <w:t>from tree import build_career_tree, trace_tree, find_path_to_career, get_all_careers, get_tree_metrics</w:t>
-        <w:br/>
-        <w:br/>
-        <w:t>class TestCareerTree(unittest.TestCase):</w:t>
-        <w:br/>
-        <w:t xml:space="preserve">    @classmethod</w:t>
-        <w:br/>
-        <w:t xml:space="preserve">    def setUpClass(cls):</w:t>
-        <w:br/>
-        <w:t xml:space="preserve">        cls.root = build_career_tree()</w:t>
-        <w:br/>
-        <w:br/>
-        <w:t xml:space="preserve">    def test_tree_metrics(self):</w:t>
-        <w:br/>
-        <w:t xml:space="preserve">        metrics = get_tree_metrics(self.root)</w:t>
-        <w:br/>
-        <w:t xml:space="preserve">        self.assertEqual(metrics['total_nodes'], 31)</w:t>
-        <w:br/>
-        <w:t xml:space="preserve">        self.assertEqual(metrics['leaf_nodes'], 16)</w:t>
-        <w:br/>
-        <w:t xml:space="preserve">        self.assertEqual(metrics['internal_nodes'], 15)</w:t>
-        <w:br/>
-        <w:t xml:space="preserve">        self.assertEqual(metrics['tree_height'], 4)</w:t>
-        <w:br/>
-        <w:t xml:space="preserve">        self.assertTrue(metrics['is_balanced'])</w:t>
-        <w:br/>
-        <w:br/>
-        <w:t xml:space="preserve">    def test_all_16_paths(self):</w:t>
-        <w:br/>
-        <w:t xml:space="preserve">        all_careers = set()</w:t>
-        <w:br/>
-        <w:t xml:space="preserve">        for b0 in [False, True]:</w:t>
-        <w:br/>
-        <w:t xml:space="preserve">            for b1 in [False, True]:</w:t>
-        <w:br/>
-        <w:t xml:space="preserve">                for b2 in [False, True]:</w:t>
-        <w:br/>
-        <w:t xml:space="preserve">                    for b3 in [False, True]:</w:t>
-        <w:br/>
-        <w:t xml:space="preserve">                        leaf, history = trace_tree(self.root, [b0, b1, b2, b3])</w:t>
-        <w:br/>
-        <w:t xml:space="preserve">                        self.assertTrue(leaf.is_leaf)</w:t>
-        <w:br/>
-        <w:t xml:space="preserve">                        self.assertEqual(len(history), 4)</w:t>
-        <w:br/>
-        <w:t xml:space="preserve">                        all_careers.add(leaf.career.title)</w:t>
-        <w:br/>
-        <w:t xml:space="preserve">        self.assertEqual(len(all_careers), 16)</w:t>
-        <w:br/>
-        <w:br/>
-        <w:t>if __name__ == '__main__':</w:t>
-        <w:br/>
-        <w:t xml:space="preserve">    unittest.main()</w:t>
-      </w:r>
-    </w:p>
-    <w:p>
-      <w:r>
-        <w:t>Execution of `python test_tree.py` yields:</w:t>
-        <w:br/>
-        <w:t>`Ran 3 tests in 0.000s — OK (All 16 paths, balance criteria, and search queries verified successfully).`</w:t>
-      </w:r>
-    </w:p>
-    <w:p>
-      <w:pPr>
-        <w:keepNext/>
-        <w:spacing w:before="280" w:after="80"/>
-      </w:pPr>
-      <w:r>
-        <w:rPr>
-          <w:b/>
-          <w:color w:val="0F172A"/>
-          <w:sz w:val="30"/>
+          <w:sz w:val="29"/>
         </w:rPr>
         <w:t>8. Result Analysis with Output Screenshots</w:t>
       </w:r>
     </w:p>
     <w:p>
       <w:r>
-        <w:t>The system was evaluated across multiple test dimensions: UI responsiveness, deterministic traversal accuracy, backtracking fidelity, graph rendering quality, and career dossier report generation.</w:t>
+        <w:t>The compiled C binary was executed and tested across all functional modes. Below are the execution outputs and embedded architectural graphics:</w:t>
       </w:r>
     </w:p>
     <w:p>
       <w:pPr>
         <w:keepNext/>
-        <w:spacing w:before="200" w:after="60"/>
+        <w:spacing w:before="180" w:after="60"/>
       </w:pPr>
       <w:r>
         <w:rPr>
           <w:b/>
           <w:color w:val="0D9488"/>
-          <w:sz w:val="25"/>
+          <w:sz w:val="24"/>
         </w:rPr>
-        <w:t>8.1 Landing Page &amp; Assessment Interface Preview</w:t>
+        <w:t>8.1 Terminal Assessment Execution Output</w:t>
       </w:r>
     </w:p>
     <w:p>
       <w:r>
-        <w:t>Figure 1 illustrates the initial landing page. The user is greeted by the modern dark teal header hero banner, the Decision Stage indicator (Step 1 of 4), the assessment context tip box, high-contrast decision buttons, and the real-time live traversal metrics card showing depth and candidate pathways remaining.</w:t>
-      </w:r>
-    </w:p>
-    <w:p>
-      <w:r>
-        <w:drawing>
-          <wp:inline xmlns:a="http://schemas.openxmlformats.org/drawingml/2006/main" xmlns:pic="http://schemas.openxmlformats.org/drawingml/2006/picture">
-            <wp:extent cx="5669280" cy="3386348"/>
-            <wp:docPr id="1" name="Picture 1"/>
-            <wp:cNvGraphicFramePr>
-              <a:graphicFrameLocks noChangeAspect="1"/>
-            </wp:cNvGraphicFramePr>
-            <a:graphic>
-              <a:graphicData uri="http://schemas.openxmlformats.org/drawingml/2006/picture">
-                <pic:pic>
-                  <pic:nvPicPr>
-                    <pic:cNvPr id="0" name="01_landing_page_preview.png"/>
-                    <pic:cNvPicPr/>
-                  </pic:nvPicPr>
-                  <pic:blipFill>
-                    <a:blip r:embed="rId9"/>
-                    <a:stretch>
-                      <a:fillRect/>
-                    </a:stretch>
-                  </pic:blipFill>
-                  <pic:spPr>
-                    <a:xfrm>
-                      <a:off x="0" y="0"/>
-                      <a:ext cx="5669280" cy="3386348"/>
-                    </a:xfrm>
-                    <a:prstGeom prst="rect"/>
-                  </pic:spPr>
-                </pic:pic>
-              </a:graphicData>
-            </a:graphic>
-          </wp:inline>
-        </w:drawing>
+        <w:t>Following binary choices [YES -&gt; YES -&gt; YES -&gt; YES] in the interactive CLI cleanly produces the following recommendation:</w:t>
       </w:r>
     </w:p>
     <w:p>
       <w:pPr>
-        <w:jc w:val="center"/>
+        <w:spacing w:before="60" w:after="60"/>
+        <w:ind w:left="360"/>
       </w:pPr>
       <w:r>
         <w:rPr>
-          <w:i/>
-          <w:sz w:val="19"/>
+          <w:rFonts w:ascii="Consolas" w:hAnsi="Consolas"/>
+          <w:color w:val="1E293B"/>
+          <w:sz w:val="18"/>
         </w:rPr>
-        <w:t>Figure 1: CareerTree Interactive Questionnaire Interface with Context Tips and Live Metrics.</w:t>
+        <w:t>================================================================================</w:t>
+        <w:br/>
+        <w:t xml:space="preserve">  RECOMMENDED CAREER TRAJECTORY: Cybersecurity Analyst &amp; Ethical Hacker</w:t>
+        <w:br/>
+        <w:t xml:space="preserve">  Domain Category: Security &amp; Defense | Demand: +32% (Critical global demand)</w:t>
+        <w:br/>
+        <w:t>================================================================================</w:t>
+        <w:br/>
+        <w:t>Role Overview: Monitors endpoints, conducts penetration audits, mitigates CVEs.</w:t>
+        <w:br/>
+        <w:t>Compensation Band: $95,000 - $160,000 / INR 12 - 30 LPA</w:t>
+        <w:br/>
+        <w:t>Key Skills: [TCP/IP] [Penetration Testing] [Threat Modeling] [SIEM Auditing]</w:t>
+        <w:br/>
+        <w:t>Toolchain:  &lt;Wireshark&gt; &lt;Burp Suite&gt; &lt;Metasploit&gt; &lt;Splunk&gt; &lt;Kali Linux&gt;</w:t>
+        <w:br/>
+        <w:t>Your Exact Decision Traversal Path (4 Steps):</w:t>
+        <w:br/>
+        <w:t xml:space="preserve">  1. Technical Systems vs Creative Strategy? -&gt; YES</w:t>
+        <w:br/>
+        <w:t xml:space="preserve">  2. Software Systems vs Data/AI?            -&gt; YES</w:t>
+        <w:br/>
+        <w:t xml:space="preserve">  3. Infrastructure vs Application/Games?    -&gt; YES</w:t>
+        <w:br/>
+        <w:t xml:space="preserve">  4. Defending Networks vs Cloud DevOps?     -&gt; YES</w:t>
+        <w:br/>
+        <w:t>[SUCCESS] Exported detailed dossier to 'career_recommendation.txt'!</w:t>
       </w:r>
     </w:p>
     <w:p>
       <w:pPr>
         <w:keepNext/>
-        <w:spacing w:before="200" w:after="60"/>
+        <w:spacing w:before="180" w:after="60"/>
       </w:pPr>
       <w:r>
         <w:rPr>
           <w:b/>
           <w:color w:val="0D9488"/>
-          <w:sz w:val="25"/>
+          <w:sz w:val="24"/>
         </w:rPr>
-        <w:t>8.2 Career Recommendation Dashboard Preview</w:t>
+        <w:t>8.2 Hierarchical Tree Architecture Visualization</w:t>
       </w:r>
     </w:p>
     <w:p>
       <w:r>
-        <w:t>Figure 2 illustrates the recommendation dashboard presented when a leaf node is reached (here, after following Yes -&gt; Yes -&gt; Yes -&gt; Yes to Cybersecurity Analyst &amp; Ethical Hacker). The screen displays the celebratory match card, compensation band, growth outlook, core skills, toolchains, certifications, and complete 4-step decision trace with one-click Markdown dossier download.</w:t>
-      </w:r>
-    </w:p>
-    <w:p>
-      <w:r>
-        <w:drawing>
-          <wp:inline xmlns:a="http://schemas.openxmlformats.org/drawingml/2006/main" xmlns:pic="http://schemas.openxmlformats.org/drawingml/2006/picture">
-            <wp:extent cx="5669280" cy="3386348"/>
-            <wp:docPr id="2" name="Picture 2"/>
-            <wp:cNvGraphicFramePr>
-              <a:graphicFrameLocks noChangeAspect="1"/>
-            </wp:cNvGraphicFramePr>
-            <a:graphic>
-              <a:graphicData uri="http://schemas.openxmlformats.org/drawingml/2006/picture">
-                <pic:pic>
-                  <pic:nvPicPr>
-                    <pic:cNvPr id="0" name="02_recommendation_preview.png"/>
-                    <pic:cNvPicPr/>
-                  </pic:nvPicPr>
-                  <pic:blipFill>
-                    <a:blip r:embed="rId10"/>
-                    <a:stretch>
-                      <a:fillRect/>
-                    </a:stretch>
-                  </pic:blipFill>
-                  <pic:spPr>
-                    <a:xfrm>
-                      <a:off x="0" y="0"/>
-                      <a:ext cx="5669280" cy="3386348"/>
-                    </a:xfrm>
-                    <a:prstGeom prst="rect"/>
-                  </pic:spPr>
-                </pic:pic>
-              </a:graphicData>
-            </a:graphic>
-          </wp:inline>
-        </w:drawing>
-      </w:r>
-    </w:p>
-    <w:p>
-      <w:pPr>
-        <w:jc w:val="center"/>
-      </w:pPr>
-      <w:r>
-        <w:rPr>
-          <w:i/>
-          <w:sz w:val="19"/>
-        </w:rPr>
-        <w:t>Figure 2: Career Recommendation Dashboard displaying Skills, Tools, Roadmap, and Decision Trace.</w:t>
-      </w:r>
-    </w:p>
-    <w:p>
-      <w:pPr>
-        <w:keepNext/>
-        <w:spacing w:before="200" w:after="60"/>
-      </w:pPr>
-      <w:r>
-        <w:rPr>
-          <w:b/>
-          <w:color w:val="0D9488"/>
-          <w:sz w:val="25"/>
-        </w:rPr>
-        <w:t>8.3 High-Resolution Binary Decision Tree Visualization</w:t>
-      </w:r>
-    </w:p>
-    <w:p>
-      <w:r>
-        <w:t>Figure 3 displays the complete 4-level binary decision tree generated via Matplotlib. The diagram displays all 31 nodes, with internal question nodes plotted in navy blue, career outcome leaves plotted in emerald green, and the user's active path highlighted in vibrant cyan.</w:t>
+        <w:t>Figure 1 displays the complete 4-level binary decision tree structure with 31 nodes and 16 terminal leaves:</w:t>
       </w:r>
     </w:p>
     <w:p>
@@ -2517,7 +1784,7 @@
         <w:drawing>
           <wp:inline xmlns:a="http://schemas.openxmlformats.org/drawingml/2006/main" xmlns:pic="http://schemas.openxmlformats.org/drawingml/2006/picture">
             <wp:extent cx="5669280" cy="2822295"/>
-            <wp:docPr id="3" name="Picture 3"/>
+            <wp:docPr id="1" name="Picture 1"/>
             <wp:cNvGraphicFramePr>
               <a:graphicFrameLocks noChangeAspect="1"/>
             </wp:cNvGraphicFramePr>
@@ -2529,7 +1796,7 @@
                     <pic:cNvPicPr/>
                   </pic:nvPicPr>
                   <pic:blipFill>
-                    <a:blip r:embed="rId11"/>
+                    <a:blip r:embed="rId9"/>
                     <a:stretch>
                       <a:fillRect/>
                     </a:stretch>
@@ -2557,26 +1824,21 @@
           <w:i/>
           <w:sz w:val="19"/>
         </w:rPr>
-        <w:t>Figure 3: Full 4-Level Binary Decision Tree Layout with 16 Career Leaves and Highlighted Traversal.</w:t>
+        <w:t>Figure 1: Full 4-Level Binary Decision Tree Architecture with 16 Career Outcomes.</w:t>
       </w:r>
     </w:p>
     <w:p>
       <w:pPr>
         <w:keepNext/>
-        <w:spacing w:before="200" w:after="60"/>
+        <w:spacing w:before="180" w:after="60"/>
       </w:pPr>
       <w:r>
         <w:rPr>
           <w:b/>
           <w:color w:val="0D9488"/>
-          <w:sz w:val="25"/>
+          <w:sz w:val="24"/>
         </w:rPr>
-        <w:t>8.4 Comprehensive Test Cases &amp; Validation Results</w:t>
-      </w:r>
-    </w:p>
-    <w:p>
-      <w:r>
-        <w:t>Table 2 outlines representative test cases validating the deterministic routing across diverse branches:</w:t>
+        <w:t>8.3 Comprehensive Test Cases &amp; Validation Results</w:t>
       </w:r>
     </w:p>
     <w:tbl>
@@ -2597,10 +1859,10 @@
             <w:tcW w:type="dxa" w:w="2340"/>
             <w:shd w:val="clear" w:color="auto" w:fill="0F172A"/>
             <w:tcMar>
-              <w:top w:w="80" w:type="dxa"/>
-              <w:bottom w:w="80" w:type="dxa"/>
-              <w:left w:w="100" w:type="dxa"/>
-              <w:right w:w="100" w:type="dxa"/>
+              <w:top w:w="70" w:type="dxa"/>
+              <w:bottom w:w="70" w:type="dxa"/>
+              <w:left w:w="90" w:type="dxa"/>
+              <w:right w:w="90" w:type="dxa"/>
             </w:tcMar>
           </w:tcPr>
           <w:p>
@@ -2618,10 +1880,10 @@
             <w:tcW w:type="dxa" w:w="2340"/>
             <w:shd w:val="clear" w:color="auto" w:fill="0F172A"/>
             <w:tcMar>
-              <w:top w:w="80" w:type="dxa"/>
-              <w:bottom w:w="80" w:type="dxa"/>
-              <w:left w:w="100" w:type="dxa"/>
-              <w:right w:w="100" w:type="dxa"/>
+              <w:top w:w="70" w:type="dxa"/>
+              <w:bottom w:w="70" w:type="dxa"/>
+              <w:left w:w="90" w:type="dxa"/>
+              <w:right w:w="90" w:type="dxa"/>
             </w:tcMar>
           </w:tcPr>
           <w:p>
@@ -2639,10 +1901,10 @@
             <w:tcW w:type="dxa" w:w="2340"/>
             <w:shd w:val="clear" w:color="auto" w:fill="0F172A"/>
             <w:tcMar>
-              <w:top w:w="80" w:type="dxa"/>
-              <w:bottom w:w="80" w:type="dxa"/>
-              <w:left w:w="100" w:type="dxa"/>
-              <w:right w:w="100" w:type="dxa"/>
+              <w:top w:w="70" w:type="dxa"/>
+              <w:bottom w:w="70" w:type="dxa"/>
+              <w:left w:w="90" w:type="dxa"/>
+              <w:right w:w="90" w:type="dxa"/>
             </w:tcMar>
           </w:tcPr>
           <w:p>
@@ -2660,10 +1922,10 @@
             <w:tcW w:type="dxa" w:w="2340"/>
             <w:shd w:val="clear" w:color="auto" w:fill="0F172A"/>
             <w:tcMar>
-              <w:top w:w="80" w:type="dxa"/>
-              <w:bottom w:w="80" w:type="dxa"/>
-              <w:left w:w="100" w:type="dxa"/>
-              <w:right w:w="100" w:type="dxa"/>
+              <w:top w:w="70" w:type="dxa"/>
+              <w:bottom w:w="70" w:type="dxa"/>
+              <w:left w:w="90" w:type="dxa"/>
+              <w:right w:w="90" w:type="dxa"/>
             </w:tcMar>
           </w:tcPr>
           <w:p>
@@ -2683,10 +1945,10 @@
             <w:tcW w:type="dxa" w:w="2340"/>
             <w:shd w:val="clear" w:color="auto" w:fill="F8FAFC"/>
             <w:tcMar>
-              <w:top w:w="60" w:type="dxa"/>
-              <w:bottom w:w="60" w:type="dxa"/>
-              <w:left w:w="100" w:type="dxa"/>
-              <w:right w:w="100" w:type="dxa"/>
+              <w:top w:w="50" w:type="dxa"/>
+              <w:bottom w:w="50" w:type="dxa"/>
+              <w:left w:w="90" w:type="dxa"/>
+              <w:right w:w="90" w:type="dxa"/>
             </w:tcMar>
           </w:tcPr>
           <w:p>
@@ -2703,10 +1965,10 @@
             <w:tcW w:type="dxa" w:w="2340"/>
             <w:shd w:val="clear" w:color="auto" w:fill="F8FAFC"/>
             <w:tcMar>
-              <w:top w:w="60" w:type="dxa"/>
-              <w:bottom w:w="60" w:type="dxa"/>
-              <w:left w:w="100" w:type="dxa"/>
-              <w:right w:w="100" w:type="dxa"/>
+              <w:top w:w="50" w:type="dxa"/>
+              <w:bottom w:w="50" w:type="dxa"/>
+              <w:left w:w="90" w:type="dxa"/>
+              <w:right w:w="90" w:type="dxa"/>
             </w:tcMar>
           </w:tcPr>
           <w:p>
@@ -2720,10 +1982,10 @@
             <w:tcW w:type="dxa" w:w="2340"/>
             <w:shd w:val="clear" w:color="auto" w:fill="F8FAFC"/>
             <w:tcMar>
-              <w:top w:w="60" w:type="dxa"/>
-              <w:bottom w:w="60" w:type="dxa"/>
-              <w:left w:w="100" w:type="dxa"/>
-              <w:right w:w="100" w:type="dxa"/>
+              <w:top w:w="50" w:type="dxa"/>
+              <w:bottom w:w="50" w:type="dxa"/>
+              <w:left w:w="90" w:type="dxa"/>
+              <w:right w:w="90" w:type="dxa"/>
             </w:tcMar>
           </w:tcPr>
           <w:p>
@@ -2741,10 +2003,10 @@
             <w:tcW w:type="dxa" w:w="2340"/>
             <w:shd w:val="clear" w:color="auto" w:fill="F8FAFC"/>
             <w:tcMar>
-              <w:top w:w="60" w:type="dxa"/>
-              <w:bottom w:w="60" w:type="dxa"/>
-              <w:left w:w="100" w:type="dxa"/>
-              <w:right w:w="100" w:type="dxa"/>
+              <w:top w:w="50" w:type="dxa"/>
+              <w:bottom w:w="50" w:type="dxa"/>
+              <w:left w:w="90" w:type="dxa"/>
+              <w:right w:w="90" w:type="dxa"/>
             </w:tcMar>
           </w:tcPr>
           <w:p>
@@ -2760,10 +2022,10 @@
             <w:tcW w:type="dxa" w:w="2340"/>
             <w:shd w:val="clear" w:color="auto" w:fill="FFFFFF"/>
             <w:tcMar>
-              <w:top w:w="60" w:type="dxa"/>
-              <w:bottom w:w="60" w:type="dxa"/>
-              <w:left w:w="100" w:type="dxa"/>
-              <w:right w:w="100" w:type="dxa"/>
+              <w:top w:w="50" w:type="dxa"/>
+              <w:bottom w:w="50" w:type="dxa"/>
+              <w:left w:w="90" w:type="dxa"/>
+              <w:right w:w="90" w:type="dxa"/>
             </w:tcMar>
           </w:tcPr>
           <w:p>
@@ -2780,10 +2042,10 @@
             <w:tcW w:type="dxa" w:w="2340"/>
             <w:shd w:val="clear" w:color="auto" w:fill="FFFFFF"/>
             <w:tcMar>
-              <w:top w:w="60" w:type="dxa"/>
-              <w:bottom w:w="60" w:type="dxa"/>
-              <w:left w:w="100" w:type="dxa"/>
-              <w:right w:w="100" w:type="dxa"/>
+              <w:top w:w="50" w:type="dxa"/>
+              <w:bottom w:w="50" w:type="dxa"/>
+              <w:left w:w="90" w:type="dxa"/>
+              <w:right w:w="90" w:type="dxa"/>
             </w:tcMar>
           </w:tcPr>
           <w:p>
@@ -2797,10 +2059,10 @@
             <w:tcW w:type="dxa" w:w="2340"/>
             <w:shd w:val="clear" w:color="auto" w:fill="FFFFFF"/>
             <w:tcMar>
-              <w:top w:w="60" w:type="dxa"/>
-              <w:bottom w:w="60" w:type="dxa"/>
-              <w:left w:w="100" w:type="dxa"/>
-              <w:right w:w="100" w:type="dxa"/>
+              <w:top w:w="50" w:type="dxa"/>
+              <w:bottom w:w="50" w:type="dxa"/>
+              <w:left w:w="90" w:type="dxa"/>
+              <w:right w:w="90" w:type="dxa"/>
             </w:tcMar>
           </w:tcPr>
           <w:p>
@@ -2818,10 +2080,10 @@
             <w:tcW w:type="dxa" w:w="2340"/>
             <w:shd w:val="clear" w:color="auto" w:fill="FFFFFF"/>
             <w:tcMar>
-              <w:top w:w="60" w:type="dxa"/>
-              <w:bottom w:w="60" w:type="dxa"/>
-              <w:left w:w="100" w:type="dxa"/>
-              <w:right w:w="100" w:type="dxa"/>
+              <w:top w:w="50" w:type="dxa"/>
+              <w:bottom w:w="50" w:type="dxa"/>
+              <w:left w:w="90" w:type="dxa"/>
+              <w:right w:w="90" w:type="dxa"/>
             </w:tcMar>
           </w:tcPr>
           <w:p>
@@ -2837,10 +2099,10 @@
             <w:tcW w:type="dxa" w:w="2340"/>
             <w:shd w:val="clear" w:color="auto" w:fill="F8FAFC"/>
             <w:tcMar>
-              <w:top w:w="60" w:type="dxa"/>
-              <w:bottom w:w="60" w:type="dxa"/>
-              <w:left w:w="100" w:type="dxa"/>
-              <w:right w:w="100" w:type="dxa"/>
+              <w:top w:w="50" w:type="dxa"/>
+              <w:bottom w:w="50" w:type="dxa"/>
+              <w:left w:w="90" w:type="dxa"/>
+              <w:right w:w="90" w:type="dxa"/>
             </w:tcMar>
           </w:tcPr>
           <w:p>
@@ -2857,10 +2119,10 @@
             <w:tcW w:type="dxa" w:w="2340"/>
             <w:shd w:val="clear" w:color="auto" w:fill="F8FAFC"/>
             <w:tcMar>
-              <w:top w:w="60" w:type="dxa"/>
-              <w:bottom w:w="60" w:type="dxa"/>
-              <w:left w:w="100" w:type="dxa"/>
-              <w:right w:w="100" w:type="dxa"/>
+              <w:top w:w="50" w:type="dxa"/>
+              <w:bottom w:w="50" w:type="dxa"/>
+              <w:left w:w="90" w:type="dxa"/>
+              <w:right w:w="90" w:type="dxa"/>
             </w:tcMar>
           </w:tcPr>
           <w:p>
@@ -2874,10 +2136,10 @@
             <w:tcW w:type="dxa" w:w="2340"/>
             <w:shd w:val="clear" w:color="auto" w:fill="F8FAFC"/>
             <w:tcMar>
-              <w:top w:w="60" w:type="dxa"/>
-              <w:bottom w:w="60" w:type="dxa"/>
-              <w:left w:w="100" w:type="dxa"/>
-              <w:right w:w="100" w:type="dxa"/>
+              <w:top w:w="50" w:type="dxa"/>
+              <w:bottom w:w="50" w:type="dxa"/>
+              <w:left w:w="90" w:type="dxa"/>
+              <w:right w:w="90" w:type="dxa"/>
             </w:tcMar>
           </w:tcPr>
           <w:p>
@@ -2895,10 +2157,10 @@
             <w:tcW w:type="dxa" w:w="2340"/>
             <w:shd w:val="clear" w:color="auto" w:fill="F8FAFC"/>
             <w:tcMar>
-              <w:top w:w="60" w:type="dxa"/>
-              <w:bottom w:w="60" w:type="dxa"/>
-              <w:left w:w="100" w:type="dxa"/>
-              <w:right w:w="100" w:type="dxa"/>
+              <w:top w:w="50" w:type="dxa"/>
+              <w:bottom w:w="50" w:type="dxa"/>
+              <w:left w:w="90" w:type="dxa"/>
+              <w:right w:w="90" w:type="dxa"/>
             </w:tcMar>
           </w:tcPr>
           <w:p>
@@ -2914,10 +2176,10 @@
             <w:tcW w:type="dxa" w:w="2340"/>
             <w:shd w:val="clear" w:color="auto" w:fill="FFFFFF"/>
             <w:tcMar>
-              <w:top w:w="60" w:type="dxa"/>
-              <w:bottom w:w="60" w:type="dxa"/>
-              <w:left w:w="100" w:type="dxa"/>
-              <w:right w:w="100" w:type="dxa"/>
+              <w:top w:w="50" w:type="dxa"/>
+              <w:bottom w:w="50" w:type="dxa"/>
+              <w:left w:w="90" w:type="dxa"/>
+              <w:right w:w="90" w:type="dxa"/>
             </w:tcMar>
           </w:tcPr>
           <w:p>
@@ -2934,10 +2196,10 @@
             <w:tcW w:type="dxa" w:w="2340"/>
             <w:shd w:val="clear" w:color="auto" w:fill="FFFFFF"/>
             <w:tcMar>
-              <w:top w:w="60" w:type="dxa"/>
-              <w:bottom w:w="60" w:type="dxa"/>
-              <w:left w:w="100" w:type="dxa"/>
-              <w:right w:w="100" w:type="dxa"/>
+              <w:top w:w="50" w:type="dxa"/>
+              <w:bottom w:w="50" w:type="dxa"/>
+              <w:left w:w="90" w:type="dxa"/>
+              <w:right w:w="90" w:type="dxa"/>
             </w:tcMar>
           </w:tcPr>
           <w:p>
@@ -2951,10 +2213,10 @@
             <w:tcW w:type="dxa" w:w="2340"/>
             <w:shd w:val="clear" w:color="auto" w:fill="FFFFFF"/>
             <w:tcMar>
-              <w:top w:w="60" w:type="dxa"/>
-              <w:bottom w:w="60" w:type="dxa"/>
-              <w:left w:w="100" w:type="dxa"/>
-              <w:right w:w="100" w:type="dxa"/>
+              <w:top w:w="50" w:type="dxa"/>
+              <w:bottom w:w="50" w:type="dxa"/>
+              <w:left w:w="90" w:type="dxa"/>
+              <w:right w:w="90" w:type="dxa"/>
             </w:tcMar>
           </w:tcPr>
           <w:p>
@@ -2972,10 +2234,10 @@
             <w:tcW w:type="dxa" w:w="2340"/>
             <w:shd w:val="clear" w:color="auto" w:fill="FFFFFF"/>
             <w:tcMar>
-              <w:top w:w="60" w:type="dxa"/>
-              <w:bottom w:w="60" w:type="dxa"/>
-              <w:left w:w="100" w:type="dxa"/>
-              <w:right w:w="100" w:type="dxa"/>
+              <w:top w:w="50" w:type="dxa"/>
+              <w:bottom w:w="50" w:type="dxa"/>
+              <w:left w:w="90" w:type="dxa"/>
+              <w:right w:w="90" w:type="dxa"/>
             </w:tcMar>
           </w:tcPr>
           <w:p>
@@ -2991,10 +2253,10 @@
             <w:tcW w:type="dxa" w:w="2340"/>
             <w:shd w:val="clear" w:color="auto" w:fill="F8FAFC"/>
             <w:tcMar>
-              <w:top w:w="60" w:type="dxa"/>
-              <w:bottom w:w="60" w:type="dxa"/>
-              <w:left w:w="100" w:type="dxa"/>
-              <w:right w:w="100" w:type="dxa"/>
+              <w:top w:w="50" w:type="dxa"/>
+              <w:bottom w:w="50" w:type="dxa"/>
+              <w:left w:w="90" w:type="dxa"/>
+              <w:right w:w="90" w:type="dxa"/>
             </w:tcMar>
           </w:tcPr>
           <w:p>
@@ -3011,10 +2273,10 @@
             <w:tcW w:type="dxa" w:w="2340"/>
             <w:shd w:val="clear" w:color="auto" w:fill="F8FAFC"/>
             <w:tcMar>
-              <w:top w:w="60" w:type="dxa"/>
-              <w:bottom w:w="60" w:type="dxa"/>
-              <w:left w:w="100" w:type="dxa"/>
-              <w:right w:w="100" w:type="dxa"/>
+              <w:top w:w="50" w:type="dxa"/>
+              <w:bottom w:w="50" w:type="dxa"/>
+              <w:left w:w="90" w:type="dxa"/>
+              <w:right w:w="90" w:type="dxa"/>
             </w:tcMar>
           </w:tcPr>
           <w:p>
@@ -3028,10 +2290,10 @@
             <w:tcW w:type="dxa" w:w="2340"/>
             <w:shd w:val="clear" w:color="auto" w:fill="F8FAFC"/>
             <w:tcMar>
-              <w:top w:w="60" w:type="dxa"/>
-              <w:bottom w:w="60" w:type="dxa"/>
-              <w:left w:w="100" w:type="dxa"/>
-              <w:right w:w="100" w:type="dxa"/>
+              <w:top w:w="50" w:type="dxa"/>
+              <w:bottom w:w="50" w:type="dxa"/>
+              <w:left w:w="90" w:type="dxa"/>
+              <w:right w:w="90" w:type="dxa"/>
             </w:tcMar>
           </w:tcPr>
           <w:p>
@@ -3049,10 +2311,10 @@
             <w:tcW w:type="dxa" w:w="2340"/>
             <w:shd w:val="clear" w:color="auto" w:fill="F8FAFC"/>
             <w:tcMar>
-              <w:top w:w="60" w:type="dxa"/>
-              <w:bottom w:w="60" w:type="dxa"/>
-              <w:left w:w="100" w:type="dxa"/>
-              <w:right w:w="100" w:type="dxa"/>
+              <w:top w:w="50" w:type="dxa"/>
+              <w:bottom w:w="50" w:type="dxa"/>
+              <w:left w:w="90" w:type="dxa"/>
+              <w:right w:w="90" w:type="dxa"/>
             </w:tcMar>
           </w:tcPr>
           <w:p>
@@ -3068,10 +2330,10 @@
             <w:tcW w:type="dxa" w:w="2340"/>
             <w:shd w:val="clear" w:color="auto" w:fill="FFFFFF"/>
             <w:tcMar>
-              <w:top w:w="60" w:type="dxa"/>
-              <w:bottom w:w="60" w:type="dxa"/>
-              <w:left w:w="100" w:type="dxa"/>
-              <w:right w:w="100" w:type="dxa"/>
+              <w:top w:w="50" w:type="dxa"/>
+              <w:bottom w:w="50" w:type="dxa"/>
+              <w:left w:w="90" w:type="dxa"/>
+              <w:right w:w="90" w:type="dxa"/>
             </w:tcMar>
           </w:tcPr>
           <w:p>
@@ -3088,10 +2350,10 @@
             <w:tcW w:type="dxa" w:w="2340"/>
             <w:shd w:val="clear" w:color="auto" w:fill="FFFFFF"/>
             <w:tcMar>
-              <w:top w:w="60" w:type="dxa"/>
-              <w:bottom w:w="60" w:type="dxa"/>
-              <w:left w:w="100" w:type="dxa"/>
-              <w:right w:w="100" w:type="dxa"/>
+              <w:top w:w="50" w:type="dxa"/>
+              <w:bottom w:w="50" w:type="dxa"/>
+              <w:left w:w="90" w:type="dxa"/>
+              <w:right w:w="90" w:type="dxa"/>
             </w:tcMar>
           </w:tcPr>
           <w:p>
@@ -3105,10 +2367,10 @@
             <w:tcW w:type="dxa" w:w="2340"/>
             <w:shd w:val="clear" w:color="auto" w:fill="FFFFFF"/>
             <w:tcMar>
-              <w:top w:w="60" w:type="dxa"/>
-              <w:bottom w:w="60" w:type="dxa"/>
-              <w:left w:w="100" w:type="dxa"/>
-              <w:right w:w="100" w:type="dxa"/>
+              <w:top w:w="50" w:type="dxa"/>
+              <w:bottom w:w="50" w:type="dxa"/>
+              <w:left w:w="90" w:type="dxa"/>
+              <w:right w:w="90" w:type="dxa"/>
             </w:tcMar>
           </w:tcPr>
           <w:p>
@@ -3126,10 +2388,10 @@
             <w:tcW w:type="dxa" w:w="2340"/>
             <w:shd w:val="clear" w:color="auto" w:fill="FFFFFF"/>
             <w:tcMar>
-              <w:top w:w="60" w:type="dxa"/>
-              <w:bottom w:w="60" w:type="dxa"/>
-              <w:left w:w="100" w:type="dxa"/>
-              <w:right w:w="100" w:type="dxa"/>
+              <w:top w:w="50" w:type="dxa"/>
+              <w:bottom w:w="50" w:type="dxa"/>
+              <w:left w:w="90" w:type="dxa"/>
+              <w:right w:w="90" w:type="dxa"/>
             </w:tcMar>
           </w:tcPr>
           <w:p>
@@ -3145,10 +2407,10 @@
             <w:tcW w:type="dxa" w:w="2340"/>
             <w:shd w:val="clear" w:color="auto" w:fill="F8FAFC"/>
             <w:tcMar>
-              <w:top w:w="60" w:type="dxa"/>
-              <w:bottom w:w="60" w:type="dxa"/>
-              <w:left w:w="100" w:type="dxa"/>
-              <w:right w:w="100" w:type="dxa"/>
+              <w:top w:w="50" w:type="dxa"/>
+              <w:bottom w:w="50" w:type="dxa"/>
+              <w:left w:w="90" w:type="dxa"/>
+              <w:right w:w="90" w:type="dxa"/>
             </w:tcMar>
           </w:tcPr>
           <w:p>
@@ -3165,10 +2427,10 @@
             <w:tcW w:type="dxa" w:w="2340"/>
             <w:shd w:val="clear" w:color="auto" w:fill="F8FAFC"/>
             <w:tcMar>
-              <w:top w:w="60" w:type="dxa"/>
-              <w:bottom w:w="60" w:type="dxa"/>
-              <w:left w:w="100" w:type="dxa"/>
-              <w:right w:w="100" w:type="dxa"/>
+              <w:top w:w="50" w:type="dxa"/>
+              <w:bottom w:w="50" w:type="dxa"/>
+              <w:left w:w="90" w:type="dxa"/>
+              <w:right w:w="90" w:type="dxa"/>
             </w:tcMar>
           </w:tcPr>
           <w:p>
@@ -3182,10 +2444,10 @@
             <w:tcW w:type="dxa" w:w="2340"/>
             <w:shd w:val="clear" w:color="auto" w:fill="F8FAFC"/>
             <w:tcMar>
-              <w:top w:w="60" w:type="dxa"/>
-              <w:bottom w:w="60" w:type="dxa"/>
-              <w:left w:w="100" w:type="dxa"/>
-              <w:right w:w="100" w:type="dxa"/>
+              <w:top w:w="50" w:type="dxa"/>
+              <w:bottom w:w="50" w:type="dxa"/>
+              <w:left w:w="90" w:type="dxa"/>
+              <w:right w:w="90" w:type="dxa"/>
             </w:tcMar>
           </w:tcPr>
           <w:p>
@@ -3203,10 +2465,10 @@
             <w:tcW w:type="dxa" w:w="2340"/>
             <w:shd w:val="clear" w:color="auto" w:fill="F8FAFC"/>
             <w:tcMar>
-              <w:top w:w="60" w:type="dxa"/>
-              <w:bottom w:w="60" w:type="dxa"/>
-              <w:left w:w="100" w:type="dxa"/>
-              <w:right w:w="100" w:type="dxa"/>
+              <w:top w:w="50" w:type="dxa"/>
+              <w:bottom w:w="50" w:type="dxa"/>
+              <w:left w:w="90" w:type="dxa"/>
+              <w:right w:w="90" w:type="dxa"/>
             </w:tcMar>
           </w:tcPr>
           <w:p>
@@ -3222,10 +2484,10 @@
             <w:tcW w:type="dxa" w:w="2340"/>
             <w:shd w:val="clear" w:color="auto" w:fill="FFFFFF"/>
             <w:tcMar>
-              <w:top w:w="60" w:type="dxa"/>
-              <w:bottom w:w="60" w:type="dxa"/>
-              <w:left w:w="100" w:type="dxa"/>
-              <w:right w:w="100" w:type="dxa"/>
+              <w:top w:w="50" w:type="dxa"/>
+              <w:bottom w:w="50" w:type="dxa"/>
+              <w:left w:w="90" w:type="dxa"/>
+              <w:right w:w="90" w:type="dxa"/>
             </w:tcMar>
           </w:tcPr>
           <w:p>
@@ -3242,10 +2504,10 @@
             <w:tcW w:type="dxa" w:w="2340"/>
             <w:shd w:val="clear" w:color="auto" w:fill="FFFFFF"/>
             <w:tcMar>
-              <w:top w:w="60" w:type="dxa"/>
-              <w:bottom w:w="60" w:type="dxa"/>
-              <w:left w:w="100" w:type="dxa"/>
-              <w:right w:w="100" w:type="dxa"/>
+              <w:top w:w="50" w:type="dxa"/>
+              <w:bottom w:w="50" w:type="dxa"/>
+              <w:left w:w="90" w:type="dxa"/>
+              <w:right w:w="90" w:type="dxa"/>
             </w:tcMar>
           </w:tcPr>
           <w:p>
@@ -3259,10 +2521,10 @@
             <w:tcW w:type="dxa" w:w="2340"/>
             <w:shd w:val="clear" w:color="auto" w:fill="FFFFFF"/>
             <w:tcMar>
-              <w:top w:w="60" w:type="dxa"/>
-              <w:bottom w:w="60" w:type="dxa"/>
-              <w:left w:w="100" w:type="dxa"/>
-              <w:right w:w="100" w:type="dxa"/>
+              <w:top w:w="50" w:type="dxa"/>
+              <w:bottom w:w="50" w:type="dxa"/>
+              <w:left w:w="90" w:type="dxa"/>
+              <w:right w:w="90" w:type="dxa"/>
             </w:tcMar>
           </w:tcPr>
           <w:p>
@@ -3280,10 +2542,10 @@
             <w:tcW w:type="dxa" w:w="2340"/>
             <w:shd w:val="clear" w:color="auto" w:fill="FFFFFF"/>
             <w:tcMar>
-              <w:top w:w="60" w:type="dxa"/>
-              <w:bottom w:w="60" w:type="dxa"/>
-              <w:left w:w="100" w:type="dxa"/>
-              <w:right w:w="100" w:type="dxa"/>
+              <w:top w:w="50" w:type="dxa"/>
+              <w:bottom w:w="50" w:type="dxa"/>
+              <w:left w:w="90" w:type="dxa"/>
+              <w:right w:w="90" w:type="dxa"/>
             </w:tcMar>
           </w:tcPr>
           <w:p>
@@ -3298,39 +2560,15 @@
     <w:p>
       <w:pPr>
         <w:keepNext/>
-        <w:spacing w:before="200" w:after="60"/>
-      </w:pPr>
-      <w:r>
-        <w:rPr>
-          <w:b/>
-          <w:color w:val="0D9488"/>
-          <w:sz w:val="25"/>
-        </w:rPr>
-        <w:t>8.5 Performance and Backtracking Evaluation</w:t>
-      </w:r>
-    </w:p>
-    <w:p>
-      <w:r>
-        <w:t>Testing confirmed that traversal from root to leaf executes in under 1 millisecond due to direct pointer dereferencing. The stack-based undo mechanism successfully restored previous states without memory leaks or state corruption. Matplotlib graph rendering completed in under 150 milliseconds, providing a seamless user experience.</w:t>
-      </w:r>
-    </w:p>
-    <w:p>
-      <w:pPr>
-        <w:keepNext/>
         <w:spacing w:before="280" w:after="80"/>
       </w:pPr>
       <w:r>
         <w:rPr>
           <w:b/>
           <w:color w:val="0F172A"/>
-          <w:sz w:val="30"/>
+          <w:sz w:val="29"/>
         </w:rPr>
         <w:t>9. Limitations and Future Scope</w:t>
-      </w:r>
-    </w:p>
-    <w:p>
-      <w:r>
-        <w:t>While CareerTree successfully demonstrates deterministic binary tree operations, practical limitations and future avenues include:</w:t>
       </w:r>
     </w:p>
     <w:p>
@@ -3343,10 +2581,10 @@
           <w:b/>
           <w:color w:val="0F172A"/>
         </w:rPr>
-        <w:t>1. Discrete Binary Constraints:</w:t>
+        <w:t>1. Binary Categorization:</w:t>
       </w:r>
       <w:r>
-        <w:t xml:space="preserve"> Binary choices (Yes/No) force discrete categorizations. Future iterations can incorporate weighted Likert-scale responses (1 to 5) or multi-criteria decision analysis (AHP).</w:t>
+        <w:t xml:space="preserve"> Discrete Yes/No branches simplify traversal but can be extended to multi-criteria Likert scales (1 to 5).</w:t>
       </w:r>
     </w:p>
     <w:p>
@@ -3359,10 +2597,10 @@
           <w:b/>
           <w:color w:val="0F172A"/>
         </w:rPr>
-        <w:t>2. Data-Driven Tree Induction:</w:t>
+        <w:t>2. Statistical Induction:</w:t>
       </w:r>
       <w:r>
-        <w:t xml:space="preserve"> The current tree topology is hand-crafted based on industry domain hierarchies. A machine learning extension could induce the decision tree from empirical student dataset records using entropy-based algorithms (ID3, C4.5, or CART).</w:t>
+        <w:t xml:space="preserve"> Future versions could induce tree topology empirically from student placement datasets using entropy algorithms (CART/ID3).</w:t>
       </w:r>
     </w:p>
     <w:p>
@@ -3375,26 +2613,10 @@
           <w:b/>
           <w:color w:val="0F172A"/>
         </w:rPr>
-        <w:t>3. Dynamic API Integration:</w:t>
+        <w:t>3. Networking &amp; Sockets:</w:t>
       </w:r>
       <w:r>
-        <w:t xml:space="preserve"> Connecting to external live employment APIs (e.g., LinkedIn, Indeed) to display live job openings, real-time salary updates, and regional demand shifts.</w:t>
-      </w:r>
-    </w:p>
-    <w:p>
-      <w:pPr>
-        <w:pStyle w:val="ListBullet"/>
-        <w:spacing w:after="40"/>
-      </w:pPr>
-      <w:r>
-        <w:rPr>
-          <w:b/>
-          <w:color w:val="0F172A"/>
-        </w:rPr>
-        <w:t>4. Persistent User Profiles:</w:t>
-      </w:r>
-      <w:r>
-        <w:t xml:space="preserve"> Incorporating SQLite or PostgreSQL backend authentication to persist student assessment histories and track longitudinal skill development.</w:t>
+        <w:t xml:space="preserve"> Connecting to external employment APIs (LinkedIn/Indeed) via C sockets or libcurl to fetch live job postings.</w:t>
       </w:r>
     </w:p>
     <w:p>
@@ -3406,19 +2628,14 @@
         <w:rPr>
           <w:b/>
           <w:color w:val="0F172A"/>
-          <w:sz w:val="30"/>
+          <w:sz w:val="29"/>
         </w:rPr>
         <w:t>10. Conclusion</w:t>
       </w:r>
     </w:p>
     <w:p>
       <w:r>
-        <w:t>The CareerTree mini-project successfully demonstrates the practical implementation of a deterministic Binary Decision Tree data structure in modern software engineering. By structuring 16 diverse tech specializations across a balanced 4-level hierarchy (31 total nodes), the engine achieves optimal O(log2 N) inference time complexity, 100% explainability, and seamless stack-based backtracking.</w:t>
-      </w:r>
-    </w:p>
-    <w:p>
-      <w:r>
-        <w:t>Coupled with a modern Streamlit web dashboard, high-resolution Matplotlib graph visualization, automated test suites, and curated career intelligence roadmaps, CareerTree provides an exemplary union of theoretical computer science and practical user-centered design. The complete project has been published as an open-source repository at https://github.com/bshubhayu07/career-tree.</w:t>
+        <w:t>The CareerTree project successfully demonstrates the implementation of a full Binary Decision Tree data structure in pure C. By structuring 16 diverse tech specializations across a balanced 4-level hierarchy (31 total heap nodes), the engine achieves optimal logarithmic O(log2 N) inference time complexity, 100% explainability, stack-based O(1) backtracking, and clean post-order memory deallocation. The project bridges classical DSA rigor with practical decision-support systems.</w:t>
       </w:r>
     </w:p>
     <w:p>
@@ -3430,7 +2647,7 @@
         <w:rPr>
           <w:b/>
           <w:color w:val="0F172A"/>
-          <w:sz w:val="30"/>
+          <w:sz w:val="29"/>
         </w:rPr>
         <w:t>11. References</w:t>
       </w:r>
@@ -3448,7 +2665,7 @@
         <w:t xml:space="preserve">[1] </w:t>
       </w:r>
       <w:r>
-        <w:t>Cormen, T. H., Leiserson, C. E., Rivest, R. L., &amp; Stein, C. (2009). Introduction to Algorithms (3rd ed.). MIT Press. Chapter 12: Binary Search Trees, pp. 286–307.</w:t>
+        <w:t>Kernighan, B. W., &amp; Ritchie, D. M. (1988). The C Programming Language (2nd ed.). Prentice Hall. Chapters 5 &amp; 6: Pointers and Structures.</w:t>
       </w:r>
     </w:p>
     <w:p>
@@ -3464,7 +2681,7 @@
         <w:t xml:space="preserve">[2] </w:t>
       </w:r>
       <w:r>
-        <w:t>Sedgewick, R., &amp; Wayne, K. (2011). Algorithms (4th ed.). Addison-Wesley Professional. Section 3.2: Binary Search Trees.</w:t>
+        <w:t>Cormen, T. H., Leiserson, C. E., Rivest, R. L., &amp; Stein, C. (2009). Introduction to Algorithms (3rd ed.). MIT Press. Chapter 12: Binary Search Trees.</w:t>
       </w:r>
     </w:p>
     <w:p>
@@ -3480,7 +2697,7 @@
         <w:t xml:space="preserve">[3] </w:t>
       </w:r>
       <w:r>
-        <w:t>Python Software Foundation (2026). Python 3.14 Documentation: Data Structures, Collections, and Recursion. Retrieved from https://docs.python.org/3/</w:t>
+        <w:t>Sedgewick, R. (1998). Algorithms in C, Parts 1-4: Fundamentals, Data Structures, Sorting, Searching (3rd ed.). Addison-Wesley.</w:t>
       </w:r>
     </w:p>
     <w:p>
@@ -3496,7 +2713,7 @@
         <w:t xml:space="preserve">[4] </w:t>
       </w:r>
       <w:r>
-        <w:t>Streamlit Inc. (2026). Streamlit Developer Documentation: Session State, Reactive Execution, and Component Architecture. Retrieved from https://docs.streamlit.io/</w:t>
+        <w:t>ISO/IEC 9899:1999. Programming Languages — C (C99 Standard Specification). International Organization for Standardization.</w:t>
       </w:r>
     </w:p>
     <w:p>
@@ -3512,39 +2729,7 @@
         <w:t xml:space="preserve">[5] </w:t>
       </w:r>
       <w:r>
-        <w:t>Hunter, J. D. (2007). Matplotlib: A 2D Graphics Environment. Computing in Science &amp; Engineering, 9(3), 90–95. https://doi.org/10.1109/MCSE.2007.55</w:t>
-      </w:r>
-    </w:p>
-    <w:p>
-      <w:pPr>
-        <w:pStyle w:val="ListNumber"/>
-        <w:spacing w:after="40"/>
-      </w:pPr>
-      <w:r>
-        <w:rPr>
-          <w:b/>
-          <w:color w:val="0F172A"/>
-        </w:rPr>
-        <w:t xml:space="preserve">[6] </w:t>
-      </w:r>
-      <w:r>
-        <w:t>Quinlan, J. R. (1986). Induction of Decision Trees. Machine Learning, 1(1), 81–106. https://doi.org/10.1007/BF00116251</w:t>
-      </w:r>
-    </w:p>
-    <w:p>
-      <w:pPr>
-        <w:pStyle w:val="ListNumber"/>
-        <w:spacing w:after="40"/>
-      </w:pPr>
-      <w:r>
-        <w:rPr>
-          <w:b/>
-          <w:color w:val="0F172A"/>
-        </w:rPr>
-        <w:t xml:space="preserve">[7] </w:t>
-      </w:r>
-      <w:r>
-        <w:t>Bhattacharya, S. (2026). CareerTree: Deterministic Binary Decision Tree Career Advisor (Source Code Repository). GitHub. https://github.com/bshubhayu07/career-tree</w:t>
+        <w:t>Bhattacharya, S. (2026). CareerTree: Binary Decision Tree Engine in Pure C. GitHub Repository: https://github.com/bshubhayu07/career-tree</w:t>
       </w:r>
     </w:p>
     <w:sectPr>

</xml_diff>